<commit_message>
Alistando la documentacion para la entrega del ae2
documentacion al dia de la fecha
</commit_message>
<xml_diff>
--- a/Documentación/Manuales/Manual de usuario Modulo 1 Y 6.docx
+++ b/Documentación/Manuales/Manual de usuario Modulo 1 Y 6.docx
@@ -86,7 +86,7 @@
     </w:p>
     <w:p>
       <w:pPr>
-        <w:jc w:val="both"/>
+        <w:jc w:val="center"/>
         <w:rPr>
           <w:rFonts w:ascii="Times New Roman" w:hAnsi="Times New Roman" w:cs="Times New Roman"/>
           <w:color w:val="000000" w:themeColor="text1"/>
@@ -107,7 +107,7 @@
     </w:p>
     <w:p>
       <w:pPr>
-        <w:jc w:val="both"/>
+        <w:jc w:val="center"/>
         <w:rPr>
           <w:rFonts w:ascii="Times New Roman" w:hAnsi="Times New Roman" w:cs="Times New Roman"/>
           <w:color w:val="000000" w:themeColor="text1"/>
@@ -136,7 +136,7 @@
     </w:p>
     <w:p>
       <w:pPr>
-        <w:jc w:val="both"/>
+        <w:jc w:val="center"/>
         <w:rPr>
           <w:rFonts w:ascii="Times New Roman" w:hAnsi="Times New Roman" w:cs="Times New Roman"/>
           <w:color w:val="000000" w:themeColor="text1"/>
@@ -165,7 +165,7 @@
     </w:p>
     <w:p>
       <w:pPr>
-        <w:jc w:val="both"/>
+        <w:jc w:val="center"/>
         <w:rPr>
           <w:rFonts w:ascii="Times New Roman" w:hAnsi="Times New Roman" w:cs="Times New Roman"/>
           <w:color w:val="000000" w:themeColor="text1"/>
@@ -194,7 +194,7 @@
     </w:p>
     <w:p>
       <w:pPr>
-        <w:jc w:val="both"/>
+        <w:jc w:val="center"/>
         <w:rPr>
           <w:rFonts w:ascii="Times New Roman" w:hAnsi="Times New Roman" w:cs="Times New Roman"/>
           <w:color w:val="000000" w:themeColor="text1"/>
@@ -215,7 +215,7 @@
     </w:p>
     <w:p>
       <w:pPr>
-        <w:jc w:val="both"/>
+        <w:jc w:val="center"/>
         <w:rPr>
           <w:rFonts w:ascii="Times New Roman" w:hAnsi="Times New Roman" w:cs="Times New Roman"/>
           <w:color w:val="000000" w:themeColor="text1"/>
@@ -244,7 +244,7 @@
     </w:p>
     <w:p>
       <w:pPr>
-        <w:jc w:val="both"/>
+        <w:jc w:val="center"/>
         <w:rPr>
           <w:rFonts w:ascii="Times New Roman" w:hAnsi="Times New Roman" w:cs="Times New Roman"/>
           <w:color w:val="000000" w:themeColor="text1"/>
@@ -273,7 +273,7 @@
     </w:p>
     <w:p>
       <w:pPr>
-        <w:jc w:val="both"/>
+        <w:jc w:val="center"/>
         <w:rPr>
           <w:rFonts w:ascii="Times New Roman" w:hAnsi="Times New Roman" w:cs="Times New Roman"/>
           <w:color w:val="000000" w:themeColor="text1"/>
@@ -284,7 +284,7 @@
     </w:p>
     <w:p>
       <w:pPr>
-        <w:jc w:val="both"/>
+        <w:jc w:val="center"/>
         <w:rPr>
           <w:rFonts w:ascii="Times New Roman" w:eastAsia="Times New Roman" w:hAnsi="Times New Roman" w:cs="Times New Roman"/>
           <w:b/>
@@ -303,6 +303,17 @@
         </w:rPr>
         <w:t>Sistema de gestión integral y atención al cliente para Villafañe Wifi</w:t>
       </w:r>
+    </w:p>
+    <w:p>
+      <w:pPr>
+        <w:jc w:val="center"/>
+        <w:rPr>
+          <w:rFonts w:ascii="Times New Roman" w:hAnsi="Times New Roman" w:cs="Times New Roman"/>
+          <w:color w:val="000000" w:themeColor="text1"/>
+          <w:sz w:val="28"/>
+          <w:szCs w:val="28"/>
+        </w:rPr>
+      </w:pPr>
       <w:r>
         <w:rPr>
           <w:rFonts w:ascii="Times New Roman" w:eastAsia="Times New Roman" w:hAnsi="Times New Roman" w:cs="Times New Roman"/>
@@ -311,12 +322,47 @@
           <w:sz w:val="28"/>
           <w:szCs w:val="28"/>
         </w:rPr>
-        <w:t xml:space="preserve"> </w:t>
-      </w:r>
-    </w:p>
-    <w:p>
-      <w:pPr>
-        <w:jc w:val="both"/>
+        <w:t>Manual de usuario módulos 1 y 6</w:t>
+      </w:r>
+      <w:r>
+        <w:rPr>
+          <w:rFonts w:ascii="Times New Roman" w:hAnsi="Times New Roman" w:cs="Times New Roman"/>
+          <w:sz w:val="28"/>
+          <w:szCs w:val="28"/>
+        </w:rPr>
+        <w:fldChar w:fldCharType="begin"/>
+      </w:r>
+      <w:r>
+        <w:rPr>
+          <w:rFonts w:ascii="Times New Roman" w:hAnsi="Times New Roman" w:cs="Times New Roman"/>
+          <w:sz w:val="28"/>
+          <w:szCs w:val="28"/>
+        </w:rPr>
+        <w:instrText xml:space="preserve"> XE "Cliente" </w:instrText>
+      </w:r>
+      <w:r>
+        <w:rPr>
+          <w:rFonts w:ascii="Times New Roman" w:hAnsi="Times New Roman" w:cs="Times New Roman"/>
+          <w:sz w:val="28"/>
+          <w:szCs w:val="28"/>
+        </w:rPr>
+        <w:fldChar w:fldCharType="end"/>
+      </w:r>
+    </w:p>
+    <w:p>
+      <w:pPr>
+        <w:jc w:val="center"/>
+        <w:rPr>
+          <w:rFonts w:ascii="Times New Roman" w:hAnsi="Times New Roman" w:cs="Times New Roman"/>
+          <w:color w:val="000000" w:themeColor="text1"/>
+          <w:sz w:val="28"/>
+          <w:szCs w:val="28"/>
+        </w:rPr>
+      </w:pPr>
+    </w:p>
+    <w:p>
+      <w:pPr>
+        <w:jc w:val="center"/>
         <w:rPr>
           <w:rFonts w:ascii="Times New Roman" w:hAnsi="Times New Roman" w:cs="Times New Roman"/>
           <w:color w:val="000000" w:themeColor="text1"/>
@@ -332,36 +378,12 @@
           <w:sz w:val="28"/>
           <w:szCs w:val="28"/>
         </w:rPr>
-        <w:t>Manual de usuario módulos 1 y 6</w:t>
-      </w:r>
-      <w:r>
-        <w:rPr>
-          <w:rFonts w:ascii="Times New Roman" w:hAnsi="Times New Roman" w:cs="Times New Roman"/>
-          <w:sz w:val="28"/>
-          <w:szCs w:val="28"/>
-        </w:rPr>
-        <w:fldChar w:fldCharType="begin"/>
-      </w:r>
-      <w:r>
-        <w:rPr>
-          <w:rFonts w:ascii="Times New Roman" w:hAnsi="Times New Roman" w:cs="Times New Roman"/>
-          <w:sz w:val="28"/>
-          <w:szCs w:val="28"/>
-        </w:rPr>
-        <w:instrText xml:space="preserve"> XE "Cliente" </w:instrText>
-      </w:r>
-      <w:r>
-        <w:rPr>
-          <w:rFonts w:ascii="Times New Roman" w:hAnsi="Times New Roman" w:cs="Times New Roman"/>
-          <w:sz w:val="28"/>
-          <w:szCs w:val="28"/>
-        </w:rPr>
-        <w:fldChar w:fldCharType="end"/>
-      </w:r>
-    </w:p>
-    <w:p>
-      <w:pPr>
-        <w:jc w:val="both"/>
+        <w:t>Alumnos:</w:t>
+      </w:r>
+    </w:p>
+    <w:p>
+      <w:pPr>
+        <w:jc w:val="center"/>
         <w:rPr>
           <w:rFonts w:ascii="Times New Roman" w:hAnsi="Times New Roman" w:cs="Times New Roman"/>
           <w:color w:val="000000" w:themeColor="text1"/>
@@ -369,10 +391,18 @@
           <w:szCs w:val="28"/>
         </w:rPr>
       </w:pPr>
-    </w:p>
-    <w:p>
-      <w:pPr>
-        <w:jc w:val="both"/>
+      <w:r>
+        <w:rPr>
+          <w:rFonts w:ascii="Times New Roman" w:eastAsia="Times New Roman" w:hAnsi="Times New Roman" w:cs="Times New Roman"/>
+          <w:sz w:val="28"/>
+          <w:szCs w:val="28"/>
+        </w:rPr>
+        <w:t>Belazquez, Agustín Lautaro: 46.066.193</w:t>
+      </w:r>
+    </w:p>
+    <w:p>
+      <w:pPr>
+        <w:jc w:val="center"/>
         <w:rPr>
           <w:rFonts w:ascii="Times New Roman" w:hAnsi="Times New Roman" w:cs="Times New Roman"/>
           <w:color w:val="000000" w:themeColor="text1"/>
@@ -383,46 +413,6 @@
       <w:r>
         <w:rPr>
           <w:rFonts w:ascii="Times New Roman" w:eastAsia="Times New Roman" w:hAnsi="Times New Roman" w:cs="Times New Roman"/>
-          <w:b/>
-          <w:bCs/>
-          <w:sz w:val="28"/>
-          <w:szCs w:val="28"/>
-        </w:rPr>
-        <w:t>Alumnos:</w:t>
-      </w:r>
-    </w:p>
-    <w:p>
-      <w:pPr>
-        <w:jc w:val="both"/>
-        <w:rPr>
-          <w:rFonts w:ascii="Times New Roman" w:hAnsi="Times New Roman" w:cs="Times New Roman"/>
-          <w:color w:val="000000" w:themeColor="text1"/>
-          <w:sz w:val="28"/>
-          <w:szCs w:val="28"/>
-        </w:rPr>
-      </w:pPr>
-      <w:r>
-        <w:rPr>
-          <w:rFonts w:ascii="Times New Roman" w:eastAsia="Times New Roman" w:hAnsi="Times New Roman" w:cs="Times New Roman"/>
-          <w:sz w:val="28"/>
-          <w:szCs w:val="28"/>
-        </w:rPr>
-        <w:t>Belazquez, Agustín Lautaro: 46.066.193</w:t>
-      </w:r>
-    </w:p>
-    <w:p>
-      <w:pPr>
-        <w:jc w:val="both"/>
-        <w:rPr>
-          <w:rFonts w:ascii="Times New Roman" w:hAnsi="Times New Roman" w:cs="Times New Roman"/>
-          <w:color w:val="000000" w:themeColor="text1"/>
-          <w:sz w:val="28"/>
-          <w:szCs w:val="28"/>
-        </w:rPr>
-      </w:pPr>
-      <w:r>
-        <w:rPr>
-          <w:rFonts w:ascii="Times New Roman" w:eastAsia="Times New Roman" w:hAnsi="Times New Roman" w:cs="Times New Roman"/>
           <w:sz w:val="28"/>
           <w:szCs w:val="28"/>
         </w:rPr>
@@ -431,7 +421,7 @@
     </w:p>
     <w:p>
       <w:pPr>
-        <w:jc w:val="both"/>
+        <w:jc w:val="center"/>
         <w:rPr>
           <w:rFonts w:ascii="Times New Roman" w:hAnsi="Times New Roman" w:cs="Times New Roman"/>
           <w:color w:val="123F36"/>
@@ -442,18 +432,7 @@
     </w:p>
     <w:p>
       <w:pPr>
-        <w:jc w:val="both"/>
-        <w:rPr>
-          <w:rFonts w:ascii="Times New Roman" w:hAnsi="Times New Roman" w:cs="Times New Roman"/>
-          <w:color w:val="123F36"/>
-          <w:sz w:val="28"/>
-          <w:szCs w:val="28"/>
-        </w:rPr>
-      </w:pPr>
-    </w:p>
-    <w:p>
-      <w:pPr>
-        <w:jc w:val="both"/>
+        <w:jc w:val="center"/>
         <w:rPr>
           <w:rFonts w:ascii="Times New Roman" w:hAnsi="Times New Roman" w:cs="Times New Roman"/>
           <w:color w:val="123F36"/>
@@ -555,13 +534,12 @@
             <w:tabs>
               <w:tab w:val="right" w:leader="dot" w:pos="8778"/>
             </w:tabs>
-            <w:jc w:val="both"/>
             <w:rPr>
-              <w:rFonts w:ascii="Times New Roman" w:hAnsi="Times New Roman" w:cs="Times New Roman"/>
+              <w:noProof/>
               <w:kern w:val="2"/>
-              <w:sz w:val="28"/>
-              <w:szCs w:val="28"/>
-              <w:lang w:eastAsia="es-AR"/>
+              <w:sz w:val="24"/>
+              <w:szCs w:val="24"/>
+              <w:lang w:val="es-AR" w:eastAsia="es-AR"/>
               <w14:ligatures w14:val="standardContextual"/>
             </w:rPr>
           </w:pPr>
@@ -589,75 +567,60 @@
             </w:rPr>
             <w:fldChar w:fldCharType="separate"/>
           </w:r>
-          <w:hyperlink w:anchor="_Toc239430861" w:history="1">
+          <w:hyperlink w:anchor="_Toc241855802" w:history="1">
             <w:r>
               <w:rPr>
                 <w:rStyle w:val="Hipervnculo"/>
                 <w:rFonts w:ascii="Times New Roman" w:hAnsi="Times New Roman" w:cs="Times New Roman"/>
-                <w:sz w:val="28"/>
-                <w:szCs w:val="28"/>
-              </w:rPr>
-              <w:t>1.  Introducción al sistema</w:t>
-            </w:r>
-            <w:r>
-              <w:rPr>
-                <w:rFonts w:ascii="Times New Roman" w:hAnsi="Times New Roman" w:cs="Times New Roman"/>
-                <w:webHidden/>
-                <w:sz w:val="28"/>
-                <w:szCs w:val="28"/>
+                <w:noProof/>
+              </w:rPr>
+              <w:t>1. Introducción al sistema</w:t>
+            </w:r>
+            <w:r>
+              <w:rPr>
+                <w:noProof/>
+                <w:webHidden/>
               </w:rPr>
               <w:tab/>
             </w:r>
             <w:r>
               <w:rPr>
-                <w:rFonts w:ascii="Times New Roman" w:hAnsi="Times New Roman" w:cs="Times New Roman"/>
-                <w:webHidden/>
-                <w:sz w:val="28"/>
-                <w:szCs w:val="28"/>
+                <w:noProof/>
+                <w:webHidden/>
               </w:rPr>
               <w:fldChar w:fldCharType="begin"/>
             </w:r>
             <w:r>
               <w:rPr>
-                <w:rFonts w:ascii="Times New Roman" w:hAnsi="Times New Roman" w:cs="Times New Roman"/>
-                <w:webHidden/>
-                <w:sz w:val="28"/>
-                <w:szCs w:val="28"/>
-              </w:rPr>
-              <w:instrText xml:space="preserve"> PAGEREF _Toc239430861 \h </w:instrText>
-            </w:r>
-            <w:r>
-              <w:rPr>
-                <w:rFonts w:ascii="Times New Roman" w:hAnsi="Times New Roman" w:cs="Times New Roman"/>
-                <w:webHidden/>
-                <w:sz w:val="28"/>
-                <w:szCs w:val="28"/>
-              </w:rPr>
-            </w:r>
-            <w:r>
-              <w:rPr>
-                <w:rFonts w:ascii="Times New Roman" w:hAnsi="Times New Roman" w:cs="Times New Roman"/>
-                <w:webHidden/>
-                <w:sz w:val="28"/>
-                <w:szCs w:val="28"/>
+                <w:noProof/>
+                <w:webHidden/>
+              </w:rPr>
+              <w:instrText xml:space="preserve"> PAGEREF _Toc241855802 \h </w:instrText>
+            </w:r>
+            <w:r>
+              <w:rPr>
+                <w:noProof/>
+                <w:webHidden/>
+              </w:rPr>
+            </w:r>
+            <w:r>
+              <w:rPr>
+                <w:noProof/>
+                <w:webHidden/>
               </w:rPr>
               <w:fldChar w:fldCharType="separate"/>
             </w:r>
             <w:r>
               <w:rPr>
-                <w:rFonts w:ascii="Times New Roman" w:hAnsi="Times New Roman" w:cs="Times New Roman"/>
-                <w:webHidden/>
-                <w:sz w:val="28"/>
-                <w:szCs w:val="28"/>
+                <w:noProof/>
+                <w:webHidden/>
               </w:rPr>
               <w:t>3</w:t>
             </w:r>
             <w:r>
               <w:rPr>
-                <w:rFonts w:ascii="Times New Roman" w:hAnsi="Times New Roman" w:cs="Times New Roman"/>
-                <w:webHidden/>
-                <w:sz w:val="28"/>
-                <w:szCs w:val="28"/>
+                <w:noProof/>
+                <w:webHidden/>
               </w:rPr>
               <w:fldChar w:fldCharType="end"/>
             </w:r>
@@ -669,85 +632,69 @@
             <w:tabs>
               <w:tab w:val="right" w:leader="dot" w:pos="8778"/>
             </w:tabs>
-            <w:jc w:val="both"/>
             <w:rPr>
-              <w:rFonts w:ascii="Times New Roman" w:hAnsi="Times New Roman" w:cs="Times New Roman"/>
+              <w:noProof/>
               <w:kern w:val="2"/>
-              <w:sz w:val="28"/>
-              <w:szCs w:val="28"/>
-              <w:lang w:eastAsia="es-AR"/>
+              <w:sz w:val="24"/>
+              <w:szCs w:val="24"/>
+              <w:lang w:val="es-AR" w:eastAsia="es-AR"/>
               <w14:ligatures w14:val="standardContextual"/>
             </w:rPr>
           </w:pPr>
-          <w:hyperlink w:anchor="_Toc239430862" w:history="1">
+          <w:hyperlink w:anchor="_Toc241855803" w:history="1">
             <w:r>
               <w:rPr>
                 <w:rStyle w:val="Hipervnculo"/>
                 <w:rFonts w:ascii="Times New Roman" w:hAnsi="Times New Roman" w:cs="Times New Roman"/>
-                <w:sz w:val="28"/>
-                <w:szCs w:val="28"/>
-              </w:rPr>
-              <w:t>2.  Acceso al sistema</w:t>
-            </w:r>
-            <w:r>
-              <w:rPr>
-                <w:rFonts w:ascii="Times New Roman" w:hAnsi="Times New Roman" w:cs="Times New Roman"/>
-                <w:webHidden/>
-                <w:sz w:val="28"/>
-                <w:szCs w:val="28"/>
+                <w:noProof/>
+              </w:rPr>
+              <w:t>2. Acceso al sistema</w:t>
+            </w:r>
+            <w:r>
+              <w:rPr>
+                <w:noProof/>
+                <w:webHidden/>
               </w:rPr>
               <w:tab/>
             </w:r>
             <w:r>
               <w:rPr>
-                <w:rFonts w:ascii="Times New Roman" w:hAnsi="Times New Roman" w:cs="Times New Roman"/>
-                <w:webHidden/>
-                <w:sz w:val="28"/>
-                <w:szCs w:val="28"/>
+                <w:noProof/>
+                <w:webHidden/>
               </w:rPr>
               <w:fldChar w:fldCharType="begin"/>
             </w:r>
             <w:r>
               <w:rPr>
-                <w:rFonts w:ascii="Times New Roman" w:hAnsi="Times New Roman" w:cs="Times New Roman"/>
-                <w:webHidden/>
-                <w:sz w:val="28"/>
-                <w:szCs w:val="28"/>
-              </w:rPr>
-              <w:instrText xml:space="preserve"> PAGEREF _Toc239430862 \h </w:instrText>
-            </w:r>
-            <w:r>
-              <w:rPr>
-                <w:rFonts w:ascii="Times New Roman" w:hAnsi="Times New Roman" w:cs="Times New Roman"/>
-                <w:webHidden/>
-                <w:sz w:val="28"/>
-                <w:szCs w:val="28"/>
-              </w:rPr>
-            </w:r>
-            <w:r>
-              <w:rPr>
-                <w:rFonts w:ascii="Times New Roman" w:hAnsi="Times New Roman" w:cs="Times New Roman"/>
-                <w:webHidden/>
-                <w:sz w:val="28"/>
-                <w:szCs w:val="28"/>
+                <w:noProof/>
+                <w:webHidden/>
+              </w:rPr>
+              <w:instrText xml:space="preserve"> PAGEREF _Toc241855803 \h </w:instrText>
+            </w:r>
+            <w:r>
+              <w:rPr>
+                <w:noProof/>
+                <w:webHidden/>
+              </w:rPr>
+            </w:r>
+            <w:r>
+              <w:rPr>
+                <w:noProof/>
+                <w:webHidden/>
               </w:rPr>
               <w:fldChar w:fldCharType="separate"/>
             </w:r>
             <w:r>
               <w:rPr>
-                <w:rFonts w:ascii="Times New Roman" w:hAnsi="Times New Roman" w:cs="Times New Roman"/>
-                <w:webHidden/>
-                <w:sz w:val="28"/>
-                <w:szCs w:val="28"/>
+                <w:noProof/>
+                <w:webHidden/>
               </w:rPr>
               <w:t>3</w:t>
             </w:r>
             <w:r>
               <w:rPr>
-                <w:rFonts w:ascii="Times New Roman" w:hAnsi="Times New Roman" w:cs="Times New Roman"/>
-                <w:webHidden/>
-                <w:sz w:val="28"/>
-                <w:szCs w:val="28"/>
+                <w:noProof/>
+                <w:webHidden/>
               </w:rPr>
               <w:fldChar w:fldCharType="end"/>
             </w:r>
@@ -759,85 +706,69 @@
             <w:tabs>
               <w:tab w:val="right" w:leader="dot" w:pos="8778"/>
             </w:tabs>
-            <w:jc w:val="both"/>
             <w:rPr>
-              <w:rFonts w:ascii="Times New Roman" w:hAnsi="Times New Roman" w:cs="Times New Roman"/>
+              <w:noProof/>
               <w:kern w:val="2"/>
-              <w:sz w:val="28"/>
-              <w:szCs w:val="28"/>
-              <w:lang w:eastAsia="es-AR"/>
+              <w:sz w:val="24"/>
+              <w:szCs w:val="24"/>
+              <w:lang w:val="es-AR" w:eastAsia="es-AR"/>
               <w14:ligatures w14:val="standardContextual"/>
             </w:rPr>
           </w:pPr>
-          <w:hyperlink w:anchor="_Toc239430863" w:history="1">
+          <w:hyperlink w:anchor="_Toc241855804" w:history="1">
             <w:r>
               <w:rPr>
                 <w:rStyle w:val="Hipervnculo"/>
                 <w:rFonts w:ascii="Times New Roman" w:hAnsi="Times New Roman" w:cs="Times New Roman"/>
-                <w:sz w:val="28"/>
-                <w:szCs w:val="28"/>
-              </w:rPr>
-              <w:t>2.1  Iniciar sesión</w:t>
-            </w:r>
-            <w:r>
-              <w:rPr>
-                <w:rFonts w:ascii="Times New Roman" w:hAnsi="Times New Roman" w:cs="Times New Roman"/>
-                <w:webHidden/>
-                <w:sz w:val="28"/>
-                <w:szCs w:val="28"/>
+                <w:noProof/>
+              </w:rPr>
+              <w:t>2.1Iniciar sesión</w:t>
+            </w:r>
+            <w:r>
+              <w:rPr>
+                <w:noProof/>
+                <w:webHidden/>
               </w:rPr>
               <w:tab/>
             </w:r>
             <w:r>
               <w:rPr>
-                <w:rFonts w:ascii="Times New Roman" w:hAnsi="Times New Roman" w:cs="Times New Roman"/>
-                <w:webHidden/>
-                <w:sz w:val="28"/>
-                <w:szCs w:val="28"/>
+                <w:noProof/>
+                <w:webHidden/>
               </w:rPr>
               <w:fldChar w:fldCharType="begin"/>
             </w:r>
             <w:r>
               <w:rPr>
-                <w:rFonts w:ascii="Times New Roman" w:hAnsi="Times New Roman" w:cs="Times New Roman"/>
-                <w:webHidden/>
-                <w:sz w:val="28"/>
-                <w:szCs w:val="28"/>
-              </w:rPr>
-              <w:instrText xml:space="preserve"> PAGEREF _Toc239430863 \h </w:instrText>
-            </w:r>
-            <w:r>
-              <w:rPr>
-                <w:rFonts w:ascii="Times New Roman" w:hAnsi="Times New Roman" w:cs="Times New Roman"/>
-                <w:webHidden/>
-                <w:sz w:val="28"/>
-                <w:szCs w:val="28"/>
-              </w:rPr>
-            </w:r>
-            <w:r>
-              <w:rPr>
-                <w:rFonts w:ascii="Times New Roman" w:hAnsi="Times New Roman" w:cs="Times New Roman"/>
-                <w:webHidden/>
-                <w:sz w:val="28"/>
-                <w:szCs w:val="28"/>
+                <w:noProof/>
+                <w:webHidden/>
+              </w:rPr>
+              <w:instrText xml:space="preserve"> PAGEREF _Toc241855804 \h </w:instrText>
+            </w:r>
+            <w:r>
+              <w:rPr>
+                <w:noProof/>
+                <w:webHidden/>
+              </w:rPr>
+            </w:r>
+            <w:r>
+              <w:rPr>
+                <w:noProof/>
+                <w:webHidden/>
               </w:rPr>
               <w:fldChar w:fldCharType="separate"/>
             </w:r>
             <w:r>
               <w:rPr>
-                <w:rFonts w:ascii="Times New Roman" w:hAnsi="Times New Roman" w:cs="Times New Roman"/>
-                <w:webHidden/>
-                <w:sz w:val="28"/>
-                <w:szCs w:val="28"/>
+                <w:noProof/>
+                <w:webHidden/>
               </w:rPr>
               <w:t>3</w:t>
             </w:r>
             <w:r>
               <w:rPr>
-                <w:rFonts w:ascii="Times New Roman" w:hAnsi="Times New Roman" w:cs="Times New Roman"/>
-                <w:webHidden/>
-                <w:sz w:val="28"/>
-                <w:szCs w:val="28"/>
+                <w:noProof/>
+                <w:webHidden/>
               </w:rPr>
               <w:fldChar w:fldCharType="end"/>
             </w:r>
@@ -849,85 +780,69 @@
             <w:tabs>
               <w:tab w:val="right" w:leader="dot" w:pos="8778"/>
             </w:tabs>
-            <w:jc w:val="both"/>
             <w:rPr>
-              <w:rFonts w:ascii="Times New Roman" w:hAnsi="Times New Roman" w:cs="Times New Roman"/>
+              <w:noProof/>
               <w:kern w:val="2"/>
-              <w:sz w:val="28"/>
-              <w:szCs w:val="28"/>
-              <w:lang w:eastAsia="es-AR"/>
+              <w:sz w:val="24"/>
+              <w:szCs w:val="24"/>
+              <w:lang w:val="es-AR" w:eastAsia="es-AR"/>
               <w14:ligatures w14:val="standardContextual"/>
             </w:rPr>
           </w:pPr>
-          <w:hyperlink w:anchor="_Toc239430864" w:history="1">
+          <w:hyperlink w:anchor="_Toc241855805" w:history="1">
             <w:r>
               <w:rPr>
                 <w:rStyle w:val="Hipervnculo"/>
                 <w:rFonts w:ascii="Times New Roman" w:hAnsi="Times New Roman" w:cs="Times New Roman"/>
-                <w:sz w:val="28"/>
-                <w:szCs w:val="28"/>
-              </w:rPr>
-              <w:t>2.2  Cerrar sesión</w:t>
-            </w:r>
-            <w:r>
-              <w:rPr>
-                <w:rFonts w:ascii="Times New Roman" w:hAnsi="Times New Roman" w:cs="Times New Roman"/>
-                <w:webHidden/>
-                <w:sz w:val="28"/>
-                <w:szCs w:val="28"/>
+                <w:noProof/>
+              </w:rPr>
+              <w:t>2.2 Cerrar sesión</w:t>
+            </w:r>
+            <w:r>
+              <w:rPr>
+                <w:noProof/>
+                <w:webHidden/>
               </w:rPr>
               <w:tab/>
             </w:r>
             <w:r>
               <w:rPr>
-                <w:rFonts w:ascii="Times New Roman" w:hAnsi="Times New Roman" w:cs="Times New Roman"/>
-                <w:webHidden/>
-                <w:sz w:val="28"/>
-                <w:szCs w:val="28"/>
+                <w:noProof/>
+                <w:webHidden/>
               </w:rPr>
               <w:fldChar w:fldCharType="begin"/>
             </w:r>
             <w:r>
               <w:rPr>
-                <w:rFonts w:ascii="Times New Roman" w:hAnsi="Times New Roman" w:cs="Times New Roman"/>
-                <w:webHidden/>
-                <w:sz w:val="28"/>
-                <w:szCs w:val="28"/>
-              </w:rPr>
-              <w:instrText xml:space="preserve"> PAGEREF _Toc239430864 \h </w:instrText>
-            </w:r>
-            <w:r>
-              <w:rPr>
-                <w:rFonts w:ascii="Times New Roman" w:hAnsi="Times New Roman" w:cs="Times New Roman"/>
-                <w:webHidden/>
-                <w:sz w:val="28"/>
-                <w:szCs w:val="28"/>
-              </w:rPr>
-            </w:r>
-            <w:r>
-              <w:rPr>
-                <w:rFonts w:ascii="Times New Roman" w:hAnsi="Times New Roman" w:cs="Times New Roman"/>
-                <w:webHidden/>
-                <w:sz w:val="28"/>
-                <w:szCs w:val="28"/>
+                <w:noProof/>
+                <w:webHidden/>
+              </w:rPr>
+              <w:instrText xml:space="preserve"> PAGEREF _Toc241855805 \h </w:instrText>
+            </w:r>
+            <w:r>
+              <w:rPr>
+                <w:noProof/>
+                <w:webHidden/>
+              </w:rPr>
+            </w:r>
+            <w:r>
+              <w:rPr>
+                <w:noProof/>
+                <w:webHidden/>
               </w:rPr>
               <w:fldChar w:fldCharType="separate"/>
             </w:r>
             <w:r>
               <w:rPr>
-                <w:rFonts w:ascii="Times New Roman" w:hAnsi="Times New Roman" w:cs="Times New Roman"/>
-                <w:webHidden/>
-                <w:sz w:val="28"/>
-                <w:szCs w:val="28"/>
+                <w:noProof/>
+                <w:webHidden/>
               </w:rPr>
               <w:t>4</w:t>
             </w:r>
             <w:r>
               <w:rPr>
-                <w:rFonts w:ascii="Times New Roman" w:hAnsi="Times New Roman" w:cs="Times New Roman"/>
-                <w:webHidden/>
-                <w:sz w:val="28"/>
-                <w:szCs w:val="28"/>
+                <w:noProof/>
+                <w:webHidden/>
               </w:rPr>
               <w:fldChar w:fldCharType="end"/>
             </w:r>
@@ -939,85 +854,69 @@
             <w:tabs>
               <w:tab w:val="right" w:leader="dot" w:pos="8778"/>
             </w:tabs>
-            <w:jc w:val="both"/>
             <w:rPr>
-              <w:rFonts w:ascii="Times New Roman" w:hAnsi="Times New Roman" w:cs="Times New Roman"/>
+              <w:noProof/>
               <w:kern w:val="2"/>
-              <w:sz w:val="28"/>
-              <w:szCs w:val="28"/>
-              <w:lang w:eastAsia="es-AR"/>
+              <w:sz w:val="24"/>
+              <w:szCs w:val="24"/>
+              <w:lang w:val="es-AR" w:eastAsia="es-AR"/>
               <w14:ligatures w14:val="standardContextual"/>
             </w:rPr>
           </w:pPr>
-          <w:hyperlink w:anchor="_Toc239430865" w:history="1">
+          <w:hyperlink w:anchor="_Toc241855806" w:history="1">
             <w:r>
               <w:rPr>
                 <w:rStyle w:val="Hipervnculo"/>
                 <w:rFonts w:ascii="Times New Roman" w:hAnsi="Times New Roman" w:cs="Times New Roman"/>
-                <w:sz w:val="28"/>
-                <w:szCs w:val="28"/>
-              </w:rPr>
-              <w:t>3.  Panel de inicio</w:t>
-            </w:r>
-            <w:r>
-              <w:rPr>
-                <w:rFonts w:ascii="Times New Roman" w:hAnsi="Times New Roman" w:cs="Times New Roman"/>
-                <w:webHidden/>
-                <w:sz w:val="28"/>
-                <w:szCs w:val="28"/>
+                <w:noProof/>
+              </w:rPr>
+              <w:t>3. Panel de inicio</w:t>
+            </w:r>
+            <w:r>
+              <w:rPr>
+                <w:noProof/>
+                <w:webHidden/>
               </w:rPr>
               <w:tab/>
             </w:r>
             <w:r>
               <w:rPr>
-                <w:rFonts w:ascii="Times New Roman" w:hAnsi="Times New Roman" w:cs="Times New Roman"/>
-                <w:webHidden/>
-                <w:sz w:val="28"/>
-                <w:szCs w:val="28"/>
+                <w:noProof/>
+                <w:webHidden/>
               </w:rPr>
               <w:fldChar w:fldCharType="begin"/>
             </w:r>
             <w:r>
               <w:rPr>
-                <w:rFonts w:ascii="Times New Roman" w:hAnsi="Times New Roman" w:cs="Times New Roman"/>
-                <w:webHidden/>
-                <w:sz w:val="28"/>
-                <w:szCs w:val="28"/>
-              </w:rPr>
-              <w:instrText xml:space="preserve"> PAGEREF _Toc239430865 \h </w:instrText>
-            </w:r>
-            <w:r>
-              <w:rPr>
-                <w:rFonts w:ascii="Times New Roman" w:hAnsi="Times New Roman" w:cs="Times New Roman"/>
-                <w:webHidden/>
-                <w:sz w:val="28"/>
-                <w:szCs w:val="28"/>
-              </w:rPr>
-            </w:r>
-            <w:r>
-              <w:rPr>
-                <w:rFonts w:ascii="Times New Roman" w:hAnsi="Times New Roman" w:cs="Times New Roman"/>
-                <w:webHidden/>
-                <w:sz w:val="28"/>
-                <w:szCs w:val="28"/>
+                <w:noProof/>
+                <w:webHidden/>
+              </w:rPr>
+              <w:instrText xml:space="preserve"> PAGEREF _Toc241855806 \h </w:instrText>
+            </w:r>
+            <w:r>
+              <w:rPr>
+                <w:noProof/>
+                <w:webHidden/>
+              </w:rPr>
+            </w:r>
+            <w:r>
+              <w:rPr>
+                <w:noProof/>
+                <w:webHidden/>
               </w:rPr>
               <w:fldChar w:fldCharType="separate"/>
             </w:r>
             <w:r>
               <w:rPr>
-                <w:rFonts w:ascii="Times New Roman" w:hAnsi="Times New Roman" w:cs="Times New Roman"/>
-                <w:webHidden/>
-                <w:sz w:val="28"/>
-                <w:szCs w:val="28"/>
+                <w:noProof/>
+                <w:webHidden/>
               </w:rPr>
               <w:t>4</w:t>
             </w:r>
             <w:r>
               <w:rPr>
-                <w:rFonts w:ascii="Times New Roman" w:hAnsi="Times New Roman" w:cs="Times New Roman"/>
-                <w:webHidden/>
-                <w:sz w:val="28"/>
-                <w:szCs w:val="28"/>
+                <w:noProof/>
+                <w:webHidden/>
               </w:rPr>
               <w:fldChar w:fldCharType="end"/>
             </w:r>
@@ -1029,85 +928,69 @@
             <w:tabs>
               <w:tab w:val="right" w:leader="dot" w:pos="8778"/>
             </w:tabs>
-            <w:jc w:val="both"/>
             <w:rPr>
-              <w:rFonts w:ascii="Times New Roman" w:hAnsi="Times New Roman" w:cs="Times New Roman"/>
+              <w:noProof/>
               <w:kern w:val="2"/>
-              <w:sz w:val="28"/>
-              <w:szCs w:val="28"/>
-              <w:lang w:eastAsia="es-AR"/>
+              <w:sz w:val="24"/>
+              <w:szCs w:val="24"/>
+              <w:lang w:val="es-AR" w:eastAsia="es-AR"/>
               <w14:ligatures w14:val="standardContextual"/>
             </w:rPr>
           </w:pPr>
-          <w:hyperlink w:anchor="_Toc239430866" w:history="1">
+          <w:hyperlink w:anchor="_Toc241855807" w:history="1">
             <w:r>
               <w:rPr>
                 <w:rStyle w:val="Hipervnculo"/>
                 <w:rFonts w:ascii="Times New Roman" w:hAnsi="Times New Roman" w:cs="Times New Roman"/>
-                <w:sz w:val="28"/>
-                <w:szCs w:val="28"/>
-              </w:rPr>
-              <w:t>3.2  Accesos rápidos</w:t>
-            </w:r>
-            <w:r>
-              <w:rPr>
-                <w:rFonts w:ascii="Times New Roman" w:hAnsi="Times New Roman" w:cs="Times New Roman"/>
-                <w:webHidden/>
-                <w:sz w:val="28"/>
-                <w:szCs w:val="28"/>
+                <w:noProof/>
+              </w:rPr>
+              <w:t>3.2 Accesos rápidos</w:t>
+            </w:r>
+            <w:r>
+              <w:rPr>
+                <w:noProof/>
+                <w:webHidden/>
               </w:rPr>
               <w:tab/>
             </w:r>
             <w:r>
               <w:rPr>
-                <w:rFonts w:ascii="Times New Roman" w:hAnsi="Times New Roman" w:cs="Times New Roman"/>
-                <w:webHidden/>
-                <w:sz w:val="28"/>
-                <w:szCs w:val="28"/>
+                <w:noProof/>
+                <w:webHidden/>
               </w:rPr>
               <w:fldChar w:fldCharType="begin"/>
             </w:r>
             <w:r>
               <w:rPr>
-                <w:rFonts w:ascii="Times New Roman" w:hAnsi="Times New Roman" w:cs="Times New Roman"/>
-                <w:webHidden/>
-                <w:sz w:val="28"/>
-                <w:szCs w:val="28"/>
-              </w:rPr>
-              <w:instrText xml:space="preserve"> PAGEREF _Toc239430866 \h </w:instrText>
-            </w:r>
-            <w:r>
-              <w:rPr>
-                <w:rFonts w:ascii="Times New Roman" w:hAnsi="Times New Roman" w:cs="Times New Roman"/>
-                <w:webHidden/>
-                <w:sz w:val="28"/>
-                <w:szCs w:val="28"/>
-              </w:rPr>
-            </w:r>
-            <w:r>
-              <w:rPr>
-                <w:rFonts w:ascii="Times New Roman" w:hAnsi="Times New Roman" w:cs="Times New Roman"/>
-                <w:webHidden/>
-                <w:sz w:val="28"/>
-                <w:szCs w:val="28"/>
+                <w:noProof/>
+                <w:webHidden/>
+              </w:rPr>
+              <w:instrText xml:space="preserve"> PAGEREF _Toc241855807 \h </w:instrText>
+            </w:r>
+            <w:r>
+              <w:rPr>
+                <w:noProof/>
+                <w:webHidden/>
+              </w:rPr>
+            </w:r>
+            <w:r>
+              <w:rPr>
+                <w:noProof/>
+                <w:webHidden/>
               </w:rPr>
               <w:fldChar w:fldCharType="separate"/>
             </w:r>
             <w:r>
               <w:rPr>
-                <w:rFonts w:ascii="Times New Roman" w:hAnsi="Times New Roman" w:cs="Times New Roman"/>
-                <w:webHidden/>
-                <w:sz w:val="28"/>
-                <w:szCs w:val="28"/>
+                <w:noProof/>
+                <w:webHidden/>
               </w:rPr>
               <w:t>5</w:t>
             </w:r>
             <w:r>
               <w:rPr>
-                <w:rFonts w:ascii="Times New Roman" w:hAnsi="Times New Roman" w:cs="Times New Roman"/>
-                <w:webHidden/>
-                <w:sz w:val="28"/>
-                <w:szCs w:val="28"/>
+                <w:noProof/>
+                <w:webHidden/>
               </w:rPr>
               <w:fldChar w:fldCharType="end"/>
             </w:r>
@@ -1119,85 +1002,69 @@
             <w:tabs>
               <w:tab w:val="right" w:leader="dot" w:pos="8778"/>
             </w:tabs>
-            <w:jc w:val="both"/>
             <w:rPr>
-              <w:rFonts w:ascii="Times New Roman" w:hAnsi="Times New Roman" w:cs="Times New Roman"/>
+              <w:noProof/>
               <w:kern w:val="2"/>
-              <w:sz w:val="28"/>
-              <w:szCs w:val="28"/>
-              <w:lang w:eastAsia="es-AR"/>
+              <w:sz w:val="24"/>
+              <w:szCs w:val="24"/>
+              <w:lang w:val="es-AR" w:eastAsia="es-AR"/>
               <w14:ligatures w14:val="standardContextual"/>
             </w:rPr>
           </w:pPr>
-          <w:hyperlink w:anchor="_Toc239430867" w:history="1">
+          <w:hyperlink w:anchor="_Toc241855808" w:history="1">
             <w:r>
               <w:rPr>
                 <w:rStyle w:val="Hipervnculo"/>
                 <w:rFonts w:ascii="Times New Roman" w:hAnsi="Times New Roman" w:cs="Times New Roman"/>
-                <w:sz w:val="28"/>
-                <w:szCs w:val="28"/>
-              </w:rPr>
-              <w:t>3.3  Navegación lateral</w:t>
-            </w:r>
-            <w:r>
-              <w:rPr>
-                <w:rFonts w:ascii="Times New Roman" w:hAnsi="Times New Roman" w:cs="Times New Roman"/>
-                <w:webHidden/>
-                <w:sz w:val="28"/>
-                <w:szCs w:val="28"/>
+                <w:noProof/>
+              </w:rPr>
+              <w:t>3.3 Navegación lateral</w:t>
+            </w:r>
+            <w:r>
+              <w:rPr>
+                <w:noProof/>
+                <w:webHidden/>
               </w:rPr>
               <w:tab/>
             </w:r>
             <w:r>
               <w:rPr>
-                <w:rFonts w:ascii="Times New Roman" w:hAnsi="Times New Roman" w:cs="Times New Roman"/>
-                <w:webHidden/>
-                <w:sz w:val="28"/>
-                <w:szCs w:val="28"/>
+                <w:noProof/>
+                <w:webHidden/>
               </w:rPr>
               <w:fldChar w:fldCharType="begin"/>
             </w:r>
             <w:r>
               <w:rPr>
-                <w:rFonts w:ascii="Times New Roman" w:hAnsi="Times New Roman" w:cs="Times New Roman"/>
-                <w:webHidden/>
-                <w:sz w:val="28"/>
-                <w:szCs w:val="28"/>
-              </w:rPr>
-              <w:instrText xml:space="preserve"> PAGEREF _Toc239430867 \h </w:instrText>
-            </w:r>
-            <w:r>
-              <w:rPr>
-                <w:rFonts w:ascii="Times New Roman" w:hAnsi="Times New Roman" w:cs="Times New Roman"/>
-                <w:webHidden/>
-                <w:sz w:val="28"/>
-                <w:szCs w:val="28"/>
-              </w:rPr>
-            </w:r>
-            <w:r>
-              <w:rPr>
-                <w:rFonts w:ascii="Times New Roman" w:hAnsi="Times New Roman" w:cs="Times New Roman"/>
-                <w:webHidden/>
-                <w:sz w:val="28"/>
-                <w:szCs w:val="28"/>
+                <w:noProof/>
+                <w:webHidden/>
+              </w:rPr>
+              <w:instrText xml:space="preserve"> PAGEREF _Toc241855808 \h </w:instrText>
+            </w:r>
+            <w:r>
+              <w:rPr>
+                <w:noProof/>
+                <w:webHidden/>
+              </w:rPr>
+            </w:r>
+            <w:r>
+              <w:rPr>
+                <w:noProof/>
+                <w:webHidden/>
               </w:rPr>
               <w:fldChar w:fldCharType="separate"/>
             </w:r>
             <w:r>
               <w:rPr>
-                <w:rFonts w:ascii="Times New Roman" w:hAnsi="Times New Roman" w:cs="Times New Roman"/>
-                <w:webHidden/>
-                <w:sz w:val="28"/>
-                <w:szCs w:val="28"/>
+                <w:noProof/>
+                <w:webHidden/>
               </w:rPr>
               <w:t>5</w:t>
             </w:r>
             <w:r>
               <w:rPr>
-                <w:rFonts w:ascii="Times New Roman" w:hAnsi="Times New Roman" w:cs="Times New Roman"/>
-                <w:webHidden/>
-                <w:sz w:val="28"/>
-                <w:szCs w:val="28"/>
+                <w:noProof/>
+                <w:webHidden/>
               </w:rPr>
               <w:fldChar w:fldCharType="end"/>
             </w:r>
@@ -1209,85 +1076,69 @@
             <w:tabs>
               <w:tab w:val="right" w:leader="dot" w:pos="8778"/>
             </w:tabs>
-            <w:jc w:val="both"/>
             <w:rPr>
-              <w:rFonts w:ascii="Times New Roman" w:hAnsi="Times New Roman" w:cs="Times New Roman"/>
+              <w:noProof/>
               <w:kern w:val="2"/>
-              <w:sz w:val="28"/>
-              <w:szCs w:val="28"/>
-              <w:lang w:eastAsia="es-AR"/>
+              <w:sz w:val="24"/>
+              <w:szCs w:val="24"/>
+              <w:lang w:val="es-AR" w:eastAsia="es-AR"/>
               <w14:ligatures w14:val="standardContextual"/>
             </w:rPr>
           </w:pPr>
-          <w:hyperlink w:anchor="_Toc239430868" w:history="1">
+          <w:hyperlink w:anchor="_Toc241855809" w:history="1">
             <w:r>
               <w:rPr>
                 <w:rStyle w:val="Hipervnculo"/>
                 <w:rFonts w:ascii="Times New Roman" w:hAnsi="Times New Roman" w:cs="Times New Roman"/>
-                <w:sz w:val="28"/>
-                <w:szCs w:val="28"/>
-              </w:rPr>
-              <w:t>4.  Tipos de usuario y permisos</w:t>
-            </w:r>
-            <w:r>
-              <w:rPr>
-                <w:rFonts w:ascii="Times New Roman" w:hAnsi="Times New Roman" w:cs="Times New Roman"/>
-                <w:webHidden/>
-                <w:sz w:val="28"/>
-                <w:szCs w:val="28"/>
+                <w:noProof/>
+              </w:rPr>
+              <w:t>4. Tipos de usuario y permisos</w:t>
+            </w:r>
+            <w:r>
+              <w:rPr>
+                <w:noProof/>
+                <w:webHidden/>
               </w:rPr>
               <w:tab/>
             </w:r>
             <w:r>
               <w:rPr>
-                <w:rFonts w:ascii="Times New Roman" w:hAnsi="Times New Roman" w:cs="Times New Roman"/>
-                <w:webHidden/>
-                <w:sz w:val="28"/>
-                <w:szCs w:val="28"/>
+                <w:noProof/>
+                <w:webHidden/>
               </w:rPr>
               <w:fldChar w:fldCharType="begin"/>
             </w:r>
             <w:r>
               <w:rPr>
-                <w:rFonts w:ascii="Times New Roman" w:hAnsi="Times New Roman" w:cs="Times New Roman"/>
-                <w:webHidden/>
-                <w:sz w:val="28"/>
-                <w:szCs w:val="28"/>
-              </w:rPr>
-              <w:instrText xml:space="preserve"> PAGEREF _Toc239430868 \h </w:instrText>
-            </w:r>
-            <w:r>
-              <w:rPr>
-                <w:rFonts w:ascii="Times New Roman" w:hAnsi="Times New Roman" w:cs="Times New Roman"/>
-                <w:webHidden/>
-                <w:sz w:val="28"/>
-                <w:szCs w:val="28"/>
-              </w:rPr>
-            </w:r>
-            <w:r>
-              <w:rPr>
-                <w:rFonts w:ascii="Times New Roman" w:hAnsi="Times New Roman" w:cs="Times New Roman"/>
-                <w:webHidden/>
-                <w:sz w:val="28"/>
-                <w:szCs w:val="28"/>
+                <w:noProof/>
+                <w:webHidden/>
+              </w:rPr>
+              <w:instrText xml:space="preserve"> PAGEREF _Toc241855809 \h </w:instrText>
+            </w:r>
+            <w:r>
+              <w:rPr>
+                <w:noProof/>
+                <w:webHidden/>
+              </w:rPr>
+            </w:r>
+            <w:r>
+              <w:rPr>
+                <w:noProof/>
+                <w:webHidden/>
               </w:rPr>
               <w:fldChar w:fldCharType="separate"/>
             </w:r>
             <w:r>
               <w:rPr>
-                <w:rFonts w:ascii="Times New Roman" w:hAnsi="Times New Roman" w:cs="Times New Roman"/>
-                <w:webHidden/>
-                <w:sz w:val="28"/>
-                <w:szCs w:val="28"/>
-              </w:rPr>
-              <w:t>5</w:t>
-            </w:r>
-            <w:r>
-              <w:rPr>
-                <w:rFonts w:ascii="Times New Roman" w:hAnsi="Times New Roman" w:cs="Times New Roman"/>
-                <w:webHidden/>
-                <w:sz w:val="28"/>
-                <w:szCs w:val="28"/>
+                <w:noProof/>
+                <w:webHidden/>
+              </w:rPr>
+              <w:t>6</w:t>
+            </w:r>
+            <w:r>
+              <w:rPr>
+                <w:noProof/>
+                <w:webHidden/>
               </w:rPr>
               <w:fldChar w:fldCharType="end"/>
             </w:r>
@@ -1299,85 +1150,69 @@
             <w:tabs>
               <w:tab w:val="right" w:leader="dot" w:pos="8778"/>
             </w:tabs>
-            <w:jc w:val="both"/>
             <w:rPr>
-              <w:rFonts w:ascii="Times New Roman" w:hAnsi="Times New Roman" w:cs="Times New Roman"/>
+              <w:noProof/>
               <w:kern w:val="2"/>
-              <w:sz w:val="28"/>
-              <w:szCs w:val="28"/>
-              <w:lang w:eastAsia="es-AR"/>
+              <w:sz w:val="24"/>
+              <w:szCs w:val="24"/>
+              <w:lang w:val="es-AR" w:eastAsia="es-AR"/>
               <w14:ligatures w14:val="standardContextual"/>
             </w:rPr>
           </w:pPr>
-          <w:hyperlink w:anchor="_Toc239430869" w:history="1">
+          <w:hyperlink w:anchor="_Toc241855810" w:history="1">
             <w:r>
               <w:rPr>
                 <w:rStyle w:val="Hipervnculo"/>
                 <w:rFonts w:ascii="Times New Roman" w:hAnsi="Times New Roman" w:cs="Times New Roman"/>
-                <w:sz w:val="28"/>
-                <w:szCs w:val="28"/>
-              </w:rPr>
-              <w:t>4.1  Administrador</w:t>
-            </w:r>
-            <w:r>
-              <w:rPr>
-                <w:rFonts w:ascii="Times New Roman" w:hAnsi="Times New Roman" w:cs="Times New Roman"/>
-                <w:webHidden/>
-                <w:sz w:val="28"/>
-                <w:szCs w:val="28"/>
+                <w:noProof/>
+              </w:rPr>
+              <w:t>4.1 Administrador</w:t>
+            </w:r>
+            <w:r>
+              <w:rPr>
+                <w:noProof/>
+                <w:webHidden/>
               </w:rPr>
               <w:tab/>
             </w:r>
             <w:r>
               <w:rPr>
-                <w:rFonts w:ascii="Times New Roman" w:hAnsi="Times New Roman" w:cs="Times New Roman"/>
-                <w:webHidden/>
-                <w:sz w:val="28"/>
-                <w:szCs w:val="28"/>
+                <w:noProof/>
+                <w:webHidden/>
               </w:rPr>
               <w:fldChar w:fldCharType="begin"/>
             </w:r>
             <w:r>
               <w:rPr>
-                <w:rFonts w:ascii="Times New Roman" w:hAnsi="Times New Roman" w:cs="Times New Roman"/>
-                <w:webHidden/>
-                <w:sz w:val="28"/>
-                <w:szCs w:val="28"/>
-              </w:rPr>
-              <w:instrText xml:space="preserve"> PAGEREF _Toc239430869 \h </w:instrText>
-            </w:r>
-            <w:r>
-              <w:rPr>
-                <w:rFonts w:ascii="Times New Roman" w:hAnsi="Times New Roman" w:cs="Times New Roman"/>
-                <w:webHidden/>
-                <w:sz w:val="28"/>
-                <w:szCs w:val="28"/>
-              </w:rPr>
-            </w:r>
-            <w:r>
-              <w:rPr>
-                <w:rFonts w:ascii="Times New Roman" w:hAnsi="Times New Roman" w:cs="Times New Roman"/>
-                <w:webHidden/>
-                <w:sz w:val="28"/>
-                <w:szCs w:val="28"/>
+                <w:noProof/>
+                <w:webHidden/>
+              </w:rPr>
+              <w:instrText xml:space="preserve"> PAGEREF _Toc241855810 \h </w:instrText>
+            </w:r>
+            <w:r>
+              <w:rPr>
+                <w:noProof/>
+                <w:webHidden/>
+              </w:rPr>
+            </w:r>
+            <w:r>
+              <w:rPr>
+                <w:noProof/>
+                <w:webHidden/>
               </w:rPr>
               <w:fldChar w:fldCharType="separate"/>
             </w:r>
             <w:r>
               <w:rPr>
-                <w:rFonts w:ascii="Times New Roman" w:hAnsi="Times New Roman" w:cs="Times New Roman"/>
-                <w:webHidden/>
-                <w:sz w:val="28"/>
-                <w:szCs w:val="28"/>
-              </w:rPr>
-              <w:t>5</w:t>
-            </w:r>
-            <w:r>
-              <w:rPr>
-                <w:rFonts w:ascii="Times New Roman" w:hAnsi="Times New Roman" w:cs="Times New Roman"/>
-                <w:webHidden/>
-                <w:sz w:val="28"/>
-                <w:szCs w:val="28"/>
+                <w:noProof/>
+                <w:webHidden/>
+              </w:rPr>
+              <w:t>6</w:t>
+            </w:r>
+            <w:r>
+              <w:rPr>
+                <w:noProof/>
+                <w:webHidden/>
               </w:rPr>
               <w:fldChar w:fldCharType="end"/>
             </w:r>
@@ -1389,85 +1224,69 @@
             <w:tabs>
               <w:tab w:val="right" w:leader="dot" w:pos="8778"/>
             </w:tabs>
-            <w:jc w:val="both"/>
             <w:rPr>
-              <w:rFonts w:ascii="Times New Roman" w:hAnsi="Times New Roman" w:cs="Times New Roman"/>
+              <w:noProof/>
               <w:kern w:val="2"/>
-              <w:sz w:val="28"/>
-              <w:szCs w:val="28"/>
-              <w:lang w:eastAsia="es-AR"/>
+              <w:sz w:val="24"/>
+              <w:szCs w:val="24"/>
+              <w:lang w:val="es-AR" w:eastAsia="es-AR"/>
               <w14:ligatures w14:val="standardContextual"/>
             </w:rPr>
           </w:pPr>
-          <w:hyperlink w:anchor="_Toc239430870" w:history="1">
+          <w:hyperlink w:anchor="_Toc241855811" w:history="1">
             <w:r>
               <w:rPr>
                 <w:rStyle w:val="Hipervnculo"/>
                 <w:rFonts w:ascii="Times New Roman" w:hAnsi="Times New Roman" w:cs="Times New Roman"/>
-                <w:sz w:val="28"/>
-                <w:szCs w:val="28"/>
-              </w:rPr>
-              <w:t>4.2  Empleados por área</w:t>
-            </w:r>
-            <w:r>
-              <w:rPr>
-                <w:rFonts w:ascii="Times New Roman" w:hAnsi="Times New Roman" w:cs="Times New Roman"/>
-                <w:webHidden/>
-                <w:sz w:val="28"/>
-                <w:szCs w:val="28"/>
+                <w:noProof/>
+              </w:rPr>
+              <w:t>4.2 Empleados por área</w:t>
+            </w:r>
+            <w:r>
+              <w:rPr>
+                <w:noProof/>
+                <w:webHidden/>
               </w:rPr>
               <w:tab/>
             </w:r>
             <w:r>
               <w:rPr>
-                <w:rFonts w:ascii="Times New Roman" w:hAnsi="Times New Roman" w:cs="Times New Roman"/>
-                <w:webHidden/>
-                <w:sz w:val="28"/>
-                <w:szCs w:val="28"/>
+                <w:noProof/>
+                <w:webHidden/>
               </w:rPr>
               <w:fldChar w:fldCharType="begin"/>
             </w:r>
             <w:r>
               <w:rPr>
-                <w:rFonts w:ascii="Times New Roman" w:hAnsi="Times New Roman" w:cs="Times New Roman"/>
-                <w:webHidden/>
-                <w:sz w:val="28"/>
-                <w:szCs w:val="28"/>
-              </w:rPr>
-              <w:instrText xml:space="preserve"> PAGEREF _Toc239430870 \h </w:instrText>
-            </w:r>
-            <w:r>
-              <w:rPr>
-                <w:rFonts w:ascii="Times New Roman" w:hAnsi="Times New Roman" w:cs="Times New Roman"/>
-                <w:webHidden/>
-                <w:sz w:val="28"/>
-                <w:szCs w:val="28"/>
-              </w:rPr>
-            </w:r>
-            <w:r>
-              <w:rPr>
-                <w:rFonts w:ascii="Times New Roman" w:hAnsi="Times New Roman" w:cs="Times New Roman"/>
-                <w:webHidden/>
-                <w:sz w:val="28"/>
-                <w:szCs w:val="28"/>
+                <w:noProof/>
+                <w:webHidden/>
+              </w:rPr>
+              <w:instrText xml:space="preserve"> PAGEREF _Toc241855811 \h </w:instrText>
+            </w:r>
+            <w:r>
+              <w:rPr>
+                <w:noProof/>
+                <w:webHidden/>
+              </w:rPr>
+            </w:r>
+            <w:r>
+              <w:rPr>
+                <w:noProof/>
+                <w:webHidden/>
               </w:rPr>
               <w:fldChar w:fldCharType="separate"/>
             </w:r>
             <w:r>
               <w:rPr>
-                <w:rFonts w:ascii="Times New Roman" w:hAnsi="Times New Roman" w:cs="Times New Roman"/>
-                <w:webHidden/>
-                <w:sz w:val="28"/>
-                <w:szCs w:val="28"/>
-              </w:rPr>
-              <w:t>5</w:t>
-            </w:r>
-            <w:r>
-              <w:rPr>
-                <w:rFonts w:ascii="Times New Roman" w:hAnsi="Times New Roman" w:cs="Times New Roman"/>
-                <w:webHidden/>
-                <w:sz w:val="28"/>
-                <w:szCs w:val="28"/>
+                <w:noProof/>
+                <w:webHidden/>
+              </w:rPr>
+              <w:t>6</w:t>
+            </w:r>
+            <w:r>
+              <w:rPr>
+                <w:noProof/>
+                <w:webHidden/>
               </w:rPr>
               <w:fldChar w:fldCharType="end"/>
             </w:r>
@@ -1479,85 +1298,69 @@
             <w:tabs>
               <w:tab w:val="right" w:leader="dot" w:pos="8778"/>
             </w:tabs>
-            <w:jc w:val="both"/>
             <w:rPr>
-              <w:rFonts w:ascii="Times New Roman" w:hAnsi="Times New Roman" w:cs="Times New Roman"/>
+              <w:noProof/>
               <w:kern w:val="2"/>
-              <w:sz w:val="28"/>
-              <w:szCs w:val="28"/>
-              <w:lang w:eastAsia="es-AR"/>
+              <w:sz w:val="24"/>
+              <w:szCs w:val="24"/>
+              <w:lang w:val="es-AR" w:eastAsia="es-AR"/>
               <w14:ligatures w14:val="standardContextual"/>
             </w:rPr>
           </w:pPr>
-          <w:hyperlink w:anchor="_Toc239430871" w:history="1">
+          <w:hyperlink w:anchor="_Toc241855812" w:history="1">
             <w:r>
               <w:rPr>
                 <w:rStyle w:val="Hipervnculo"/>
                 <w:rFonts w:ascii="Times New Roman" w:hAnsi="Times New Roman" w:cs="Times New Roman"/>
-                <w:sz w:val="28"/>
-                <w:szCs w:val="28"/>
-              </w:rPr>
-              <w:t>4.3  Tabla de acceso al módulo Clientes</w:t>
-            </w:r>
-            <w:r>
-              <w:rPr>
-                <w:rFonts w:ascii="Times New Roman" w:hAnsi="Times New Roman" w:cs="Times New Roman"/>
-                <w:webHidden/>
-                <w:sz w:val="28"/>
-                <w:szCs w:val="28"/>
+                <w:noProof/>
+              </w:rPr>
+              <w:t>4.3 Tabla de acceso al módulo Clientes</w:t>
+            </w:r>
+            <w:r>
+              <w:rPr>
+                <w:noProof/>
+                <w:webHidden/>
               </w:rPr>
               <w:tab/>
             </w:r>
             <w:r>
               <w:rPr>
-                <w:rFonts w:ascii="Times New Roman" w:hAnsi="Times New Roman" w:cs="Times New Roman"/>
-                <w:webHidden/>
-                <w:sz w:val="28"/>
-                <w:szCs w:val="28"/>
+                <w:noProof/>
+                <w:webHidden/>
               </w:rPr>
               <w:fldChar w:fldCharType="begin"/>
             </w:r>
             <w:r>
               <w:rPr>
-                <w:rFonts w:ascii="Times New Roman" w:hAnsi="Times New Roman" w:cs="Times New Roman"/>
-                <w:webHidden/>
-                <w:sz w:val="28"/>
-                <w:szCs w:val="28"/>
-              </w:rPr>
-              <w:instrText xml:space="preserve"> PAGEREF _Toc239430871 \h </w:instrText>
-            </w:r>
-            <w:r>
-              <w:rPr>
-                <w:rFonts w:ascii="Times New Roman" w:hAnsi="Times New Roman" w:cs="Times New Roman"/>
-                <w:webHidden/>
-                <w:sz w:val="28"/>
-                <w:szCs w:val="28"/>
-              </w:rPr>
-            </w:r>
-            <w:r>
-              <w:rPr>
-                <w:rFonts w:ascii="Times New Roman" w:hAnsi="Times New Roman" w:cs="Times New Roman"/>
-                <w:webHidden/>
-                <w:sz w:val="28"/>
-                <w:szCs w:val="28"/>
+                <w:noProof/>
+                <w:webHidden/>
+              </w:rPr>
+              <w:instrText xml:space="preserve"> PAGEREF _Toc241855812 \h </w:instrText>
+            </w:r>
+            <w:r>
+              <w:rPr>
+                <w:noProof/>
+                <w:webHidden/>
+              </w:rPr>
+            </w:r>
+            <w:r>
+              <w:rPr>
+                <w:noProof/>
+                <w:webHidden/>
               </w:rPr>
               <w:fldChar w:fldCharType="separate"/>
             </w:r>
             <w:r>
               <w:rPr>
-                <w:rFonts w:ascii="Times New Roman" w:hAnsi="Times New Roman" w:cs="Times New Roman"/>
-                <w:webHidden/>
-                <w:sz w:val="28"/>
-                <w:szCs w:val="28"/>
-              </w:rPr>
-              <w:t>6</w:t>
-            </w:r>
-            <w:r>
-              <w:rPr>
-                <w:rFonts w:ascii="Times New Roman" w:hAnsi="Times New Roman" w:cs="Times New Roman"/>
-                <w:webHidden/>
-                <w:sz w:val="28"/>
-                <w:szCs w:val="28"/>
+                <w:noProof/>
+                <w:webHidden/>
+              </w:rPr>
+              <w:t>7</w:t>
+            </w:r>
+            <w:r>
+              <w:rPr>
+                <w:noProof/>
+                <w:webHidden/>
               </w:rPr>
               <w:fldChar w:fldCharType="end"/>
             </w:r>
@@ -1569,85 +1372,69 @@
             <w:tabs>
               <w:tab w:val="right" w:leader="dot" w:pos="8778"/>
             </w:tabs>
-            <w:jc w:val="both"/>
             <w:rPr>
-              <w:rFonts w:ascii="Times New Roman" w:hAnsi="Times New Roman" w:cs="Times New Roman"/>
+              <w:noProof/>
               <w:kern w:val="2"/>
-              <w:sz w:val="28"/>
-              <w:szCs w:val="28"/>
-              <w:lang w:eastAsia="es-AR"/>
+              <w:sz w:val="24"/>
+              <w:szCs w:val="24"/>
+              <w:lang w:val="es-AR" w:eastAsia="es-AR"/>
               <w14:ligatures w14:val="standardContextual"/>
             </w:rPr>
           </w:pPr>
-          <w:hyperlink w:anchor="_Toc239430872" w:history="1">
+          <w:hyperlink w:anchor="_Toc241855813" w:history="1">
             <w:r>
               <w:rPr>
                 <w:rStyle w:val="Hipervnculo"/>
                 <w:rFonts w:ascii="Times New Roman" w:hAnsi="Times New Roman" w:cs="Times New Roman"/>
-                <w:sz w:val="28"/>
-                <w:szCs w:val="28"/>
-              </w:rPr>
-              <w:t>5.  Módulo 1 – Gestión de Clientes</w:t>
-            </w:r>
-            <w:r>
-              <w:rPr>
-                <w:rFonts w:ascii="Times New Roman" w:hAnsi="Times New Roman" w:cs="Times New Roman"/>
-                <w:webHidden/>
-                <w:sz w:val="28"/>
-                <w:szCs w:val="28"/>
+                <w:noProof/>
+              </w:rPr>
+              <w:t>5. Módulo 1 – Gestión de Clientes</w:t>
+            </w:r>
+            <w:r>
+              <w:rPr>
+                <w:noProof/>
+                <w:webHidden/>
               </w:rPr>
               <w:tab/>
             </w:r>
             <w:r>
               <w:rPr>
-                <w:rFonts w:ascii="Times New Roman" w:hAnsi="Times New Roman" w:cs="Times New Roman"/>
-                <w:webHidden/>
-                <w:sz w:val="28"/>
-                <w:szCs w:val="28"/>
+                <w:noProof/>
+                <w:webHidden/>
               </w:rPr>
               <w:fldChar w:fldCharType="begin"/>
             </w:r>
             <w:r>
               <w:rPr>
-                <w:rFonts w:ascii="Times New Roman" w:hAnsi="Times New Roman" w:cs="Times New Roman"/>
-                <w:webHidden/>
-                <w:sz w:val="28"/>
-                <w:szCs w:val="28"/>
-              </w:rPr>
-              <w:instrText xml:space="preserve"> PAGEREF _Toc239430872 \h </w:instrText>
-            </w:r>
-            <w:r>
-              <w:rPr>
-                <w:rFonts w:ascii="Times New Roman" w:hAnsi="Times New Roman" w:cs="Times New Roman"/>
-                <w:webHidden/>
-                <w:sz w:val="28"/>
-                <w:szCs w:val="28"/>
-              </w:rPr>
-            </w:r>
-            <w:r>
-              <w:rPr>
-                <w:rFonts w:ascii="Times New Roman" w:hAnsi="Times New Roman" w:cs="Times New Roman"/>
-                <w:webHidden/>
-                <w:sz w:val="28"/>
-                <w:szCs w:val="28"/>
+                <w:noProof/>
+                <w:webHidden/>
+              </w:rPr>
+              <w:instrText xml:space="preserve"> PAGEREF _Toc241855813 \h </w:instrText>
+            </w:r>
+            <w:r>
+              <w:rPr>
+                <w:noProof/>
+                <w:webHidden/>
+              </w:rPr>
+            </w:r>
+            <w:r>
+              <w:rPr>
+                <w:noProof/>
+                <w:webHidden/>
               </w:rPr>
               <w:fldChar w:fldCharType="separate"/>
             </w:r>
             <w:r>
               <w:rPr>
-                <w:rFonts w:ascii="Times New Roman" w:hAnsi="Times New Roman" w:cs="Times New Roman"/>
-                <w:webHidden/>
-                <w:sz w:val="28"/>
-                <w:szCs w:val="28"/>
-              </w:rPr>
-              <w:t>7</w:t>
-            </w:r>
-            <w:r>
-              <w:rPr>
-                <w:rFonts w:ascii="Times New Roman" w:hAnsi="Times New Roman" w:cs="Times New Roman"/>
-                <w:webHidden/>
-                <w:sz w:val="28"/>
-                <w:szCs w:val="28"/>
+                <w:noProof/>
+                <w:webHidden/>
+              </w:rPr>
+              <w:t>8</w:t>
+            </w:r>
+            <w:r>
+              <w:rPr>
+                <w:noProof/>
+                <w:webHidden/>
               </w:rPr>
               <w:fldChar w:fldCharType="end"/>
             </w:r>
@@ -1659,85 +1446,69 @@
             <w:tabs>
               <w:tab w:val="right" w:leader="dot" w:pos="8778"/>
             </w:tabs>
-            <w:jc w:val="both"/>
             <w:rPr>
-              <w:rFonts w:ascii="Times New Roman" w:hAnsi="Times New Roman" w:cs="Times New Roman"/>
+              <w:noProof/>
               <w:kern w:val="2"/>
-              <w:sz w:val="28"/>
-              <w:szCs w:val="28"/>
-              <w:lang w:eastAsia="es-AR"/>
+              <w:sz w:val="24"/>
+              <w:szCs w:val="24"/>
+              <w:lang w:val="es-AR" w:eastAsia="es-AR"/>
               <w14:ligatures w14:val="standardContextual"/>
             </w:rPr>
           </w:pPr>
-          <w:hyperlink w:anchor="_Toc239430873" w:history="1">
+          <w:hyperlink w:anchor="_Toc241855814" w:history="1">
             <w:r>
               <w:rPr>
                 <w:rStyle w:val="Hipervnculo"/>
                 <w:rFonts w:ascii="Times New Roman" w:hAnsi="Times New Roman" w:cs="Times New Roman"/>
-                <w:sz w:val="28"/>
-                <w:szCs w:val="28"/>
-              </w:rPr>
-              <w:t>5.1  Consultar y buscar clientes</w:t>
-            </w:r>
-            <w:r>
-              <w:rPr>
-                <w:rFonts w:ascii="Times New Roman" w:hAnsi="Times New Roman" w:cs="Times New Roman"/>
-                <w:webHidden/>
-                <w:sz w:val="28"/>
-                <w:szCs w:val="28"/>
+                <w:noProof/>
+              </w:rPr>
+              <w:t>5.1 Consultar y buscar clientes</w:t>
+            </w:r>
+            <w:r>
+              <w:rPr>
+                <w:noProof/>
+                <w:webHidden/>
               </w:rPr>
               <w:tab/>
             </w:r>
             <w:r>
               <w:rPr>
-                <w:rFonts w:ascii="Times New Roman" w:hAnsi="Times New Roman" w:cs="Times New Roman"/>
-                <w:webHidden/>
-                <w:sz w:val="28"/>
-                <w:szCs w:val="28"/>
+                <w:noProof/>
+                <w:webHidden/>
               </w:rPr>
               <w:fldChar w:fldCharType="begin"/>
             </w:r>
             <w:r>
               <w:rPr>
-                <w:rFonts w:ascii="Times New Roman" w:hAnsi="Times New Roman" w:cs="Times New Roman"/>
-                <w:webHidden/>
-                <w:sz w:val="28"/>
-                <w:szCs w:val="28"/>
-              </w:rPr>
-              <w:instrText xml:space="preserve"> PAGEREF _Toc239430873 \h </w:instrText>
-            </w:r>
-            <w:r>
-              <w:rPr>
-                <w:rFonts w:ascii="Times New Roman" w:hAnsi="Times New Roman" w:cs="Times New Roman"/>
-                <w:webHidden/>
-                <w:sz w:val="28"/>
-                <w:szCs w:val="28"/>
-              </w:rPr>
-            </w:r>
-            <w:r>
-              <w:rPr>
-                <w:rFonts w:ascii="Times New Roman" w:hAnsi="Times New Roman" w:cs="Times New Roman"/>
-                <w:webHidden/>
-                <w:sz w:val="28"/>
-                <w:szCs w:val="28"/>
+                <w:noProof/>
+                <w:webHidden/>
+              </w:rPr>
+              <w:instrText xml:space="preserve"> PAGEREF _Toc241855814 \h </w:instrText>
+            </w:r>
+            <w:r>
+              <w:rPr>
+                <w:noProof/>
+                <w:webHidden/>
+              </w:rPr>
+            </w:r>
+            <w:r>
+              <w:rPr>
+                <w:noProof/>
+                <w:webHidden/>
               </w:rPr>
               <w:fldChar w:fldCharType="separate"/>
             </w:r>
             <w:r>
               <w:rPr>
-                <w:rFonts w:ascii="Times New Roman" w:hAnsi="Times New Roman" w:cs="Times New Roman"/>
-                <w:webHidden/>
-                <w:sz w:val="28"/>
-                <w:szCs w:val="28"/>
-              </w:rPr>
-              <w:t>7</w:t>
-            </w:r>
-            <w:r>
-              <w:rPr>
-                <w:rFonts w:ascii="Times New Roman" w:hAnsi="Times New Roman" w:cs="Times New Roman"/>
-                <w:webHidden/>
-                <w:sz w:val="28"/>
-                <w:szCs w:val="28"/>
+                <w:noProof/>
+                <w:webHidden/>
+              </w:rPr>
+              <w:t>8</w:t>
+            </w:r>
+            <w:r>
+              <w:rPr>
+                <w:noProof/>
+                <w:webHidden/>
               </w:rPr>
               <w:fldChar w:fldCharType="end"/>
             </w:r>
@@ -1749,85 +1520,69 @@
             <w:tabs>
               <w:tab w:val="right" w:leader="dot" w:pos="8778"/>
             </w:tabs>
-            <w:jc w:val="both"/>
             <w:rPr>
-              <w:rFonts w:ascii="Times New Roman" w:hAnsi="Times New Roman" w:cs="Times New Roman"/>
+              <w:noProof/>
               <w:kern w:val="2"/>
-              <w:sz w:val="28"/>
-              <w:szCs w:val="28"/>
-              <w:lang w:eastAsia="es-AR"/>
+              <w:sz w:val="24"/>
+              <w:szCs w:val="24"/>
+              <w:lang w:val="es-AR" w:eastAsia="es-AR"/>
               <w14:ligatures w14:val="standardContextual"/>
             </w:rPr>
           </w:pPr>
-          <w:hyperlink w:anchor="_Toc239430874" w:history="1">
+          <w:hyperlink w:anchor="_Toc241855815" w:history="1">
             <w:r>
               <w:rPr>
                 <w:rStyle w:val="Hipervnculo"/>
                 <w:rFonts w:ascii="Times New Roman" w:hAnsi="Times New Roman" w:cs="Times New Roman"/>
-                <w:sz w:val="28"/>
-                <w:szCs w:val="28"/>
-              </w:rPr>
-              <w:t>5.2  Ver la ficha de un cliente</w:t>
-            </w:r>
-            <w:r>
-              <w:rPr>
-                <w:rFonts w:ascii="Times New Roman" w:hAnsi="Times New Roman" w:cs="Times New Roman"/>
-                <w:webHidden/>
-                <w:sz w:val="28"/>
-                <w:szCs w:val="28"/>
+                <w:noProof/>
+              </w:rPr>
+              <w:t>5.2 Ver la ficha de un cliente</w:t>
+            </w:r>
+            <w:r>
+              <w:rPr>
+                <w:noProof/>
+                <w:webHidden/>
               </w:rPr>
               <w:tab/>
             </w:r>
             <w:r>
               <w:rPr>
-                <w:rFonts w:ascii="Times New Roman" w:hAnsi="Times New Roman" w:cs="Times New Roman"/>
-                <w:webHidden/>
-                <w:sz w:val="28"/>
-                <w:szCs w:val="28"/>
+                <w:noProof/>
+                <w:webHidden/>
               </w:rPr>
               <w:fldChar w:fldCharType="begin"/>
             </w:r>
             <w:r>
               <w:rPr>
-                <w:rFonts w:ascii="Times New Roman" w:hAnsi="Times New Roman" w:cs="Times New Roman"/>
-                <w:webHidden/>
-                <w:sz w:val="28"/>
-                <w:szCs w:val="28"/>
-              </w:rPr>
-              <w:instrText xml:space="preserve"> PAGEREF _Toc239430874 \h </w:instrText>
-            </w:r>
-            <w:r>
-              <w:rPr>
-                <w:rFonts w:ascii="Times New Roman" w:hAnsi="Times New Roman" w:cs="Times New Roman"/>
-                <w:webHidden/>
-                <w:sz w:val="28"/>
-                <w:szCs w:val="28"/>
-              </w:rPr>
-            </w:r>
-            <w:r>
-              <w:rPr>
-                <w:rFonts w:ascii="Times New Roman" w:hAnsi="Times New Roman" w:cs="Times New Roman"/>
-                <w:webHidden/>
-                <w:sz w:val="28"/>
-                <w:szCs w:val="28"/>
+                <w:noProof/>
+                <w:webHidden/>
+              </w:rPr>
+              <w:instrText xml:space="preserve"> PAGEREF _Toc241855815 \h </w:instrText>
+            </w:r>
+            <w:r>
+              <w:rPr>
+                <w:noProof/>
+                <w:webHidden/>
+              </w:rPr>
+            </w:r>
+            <w:r>
+              <w:rPr>
+                <w:noProof/>
+                <w:webHidden/>
               </w:rPr>
               <w:fldChar w:fldCharType="separate"/>
             </w:r>
             <w:r>
               <w:rPr>
-                <w:rFonts w:ascii="Times New Roman" w:hAnsi="Times New Roman" w:cs="Times New Roman"/>
-                <w:webHidden/>
-                <w:sz w:val="28"/>
-                <w:szCs w:val="28"/>
-              </w:rPr>
-              <w:t>8</w:t>
-            </w:r>
-            <w:r>
-              <w:rPr>
-                <w:rFonts w:ascii="Times New Roman" w:hAnsi="Times New Roman" w:cs="Times New Roman"/>
-                <w:webHidden/>
-                <w:sz w:val="28"/>
-                <w:szCs w:val="28"/>
+                <w:noProof/>
+                <w:webHidden/>
+              </w:rPr>
+              <w:t>9</w:t>
+            </w:r>
+            <w:r>
+              <w:rPr>
+                <w:noProof/>
+                <w:webHidden/>
               </w:rPr>
               <w:fldChar w:fldCharType="end"/>
             </w:r>
@@ -1839,85 +1594,69 @@
             <w:tabs>
               <w:tab w:val="right" w:leader="dot" w:pos="8778"/>
             </w:tabs>
-            <w:jc w:val="both"/>
             <w:rPr>
-              <w:rFonts w:ascii="Times New Roman" w:hAnsi="Times New Roman" w:cs="Times New Roman"/>
+              <w:noProof/>
               <w:kern w:val="2"/>
-              <w:sz w:val="28"/>
-              <w:szCs w:val="28"/>
-              <w:lang w:eastAsia="es-AR"/>
+              <w:sz w:val="24"/>
+              <w:szCs w:val="24"/>
+              <w:lang w:val="es-AR" w:eastAsia="es-AR"/>
               <w14:ligatures w14:val="standardContextual"/>
             </w:rPr>
           </w:pPr>
-          <w:hyperlink w:anchor="_Toc239430875" w:history="1">
+          <w:hyperlink w:anchor="_Toc241855816" w:history="1">
             <w:r>
               <w:rPr>
                 <w:rStyle w:val="Hipervnculo"/>
                 <w:rFonts w:ascii="Times New Roman" w:hAnsi="Times New Roman" w:cs="Times New Roman"/>
-                <w:sz w:val="28"/>
-                <w:szCs w:val="28"/>
-              </w:rPr>
-              <w:t>5.3  Registrar un nuevo cliente</w:t>
-            </w:r>
-            <w:r>
-              <w:rPr>
-                <w:rFonts w:ascii="Times New Roman" w:hAnsi="Times New Roman" w:cs="Times New Roman"/>
-                <w:webHidden/>
-                <w:sz w:val="28"/>
-                <w:szCs w:val="28"/>
+                <w:noProof/>
+              </w:rPr>
+              <w:t>5.3 Registrar un nuevo cliente</w:t>
+            </w:r>
+            <w:r>
+              <w:rPr>
+                <w:noProof/>
+                <w:webHidden/>
               </w:rPr>
               <w:tab/>
             </w:r>
             <w:r>
               <w:rPr>
-                <w:rFonts w:ascii="Times New Roman" w:hAnsi="Times New Roman" w:cs="Times New Roman"/>
-                <w:webHidden/>
-                <w:sz w:val="28"/>
-                <w:szCs w:val="28"/>
+                <w:noProof/>
+                <w:webHidden/>
               </w:rPr>
               <w:fldChar w:fldCharType="begin"/>
             </w:r>
             <w:r>
               <w:rPr>
-                <w:rFonts w:ascii="Times New Roman" w:hAnsi="Times New Roman" w:cs="Times New Roman"/>
-                <w:webHidden/>
-                <w:sz w:val="28"/>
-                <w:szCs w:val="28"/>
-              </w:rPr>
-              <w:instrText xml:space="preserve"> PAGEREF _Toc239430875 \h </w:instrText>
-            </w:r>
-            <w:r>
-              <w:rPr>
-                <w:rFonts w:ascii="Times New Roman" w:hAnsi="Times New Roman" w:cs="Times New Roman"/>
-                <w:webHidden/>
-                <w:sz w:val="28"/>
-                <w:szCs w:val="28"/>
-              </w:rPr>
-            </w:r>
-            <w:r>
-              <w:rPr>
-                <w:rFonts w:ascii="Times New Roman" w:hAnsi="Times New Roman" w:cs="Times New Roman"/>
-                <w:webHidden/>
-                <w:sz w:val="28"/>
-                <w:szCs w:val="28"/>
+                <w:noProof/>
+                <w:webHidden/>
+              </w:rPr>
+              <w:instrText xml:space="preserve"> PAGEREF _Toc241855816 \h </w:instrText>
+            </w:r>
+            <w:r>
+              <w:rPr>
+                <w:noProof/>
+                <w:webHidden/>
+              </w:rPr>
+            </w:r>
+            <w:r>
+              <w:rPr>
+                <w:noProof/>
+                <w:webHidden/>
               </w:rPr>
               <w:fldChar w:fldCharType="separate"/>
             </w:r>
             <w:r>
               <w:rPr>
-                <w:rFonts w:ascii="Times New Roman" w:hAnsi="Times New Roman" w:cs="Times New Roman"/>
-                <w:webHidden/>
-                <w:sz w:val="28"/>
-                <w:szCs w:val="28"/>
-              </w:rPr>
-              <w:t>9</w:t>
-            </w:r>
-            <w:r>
-              <w:rPr>
-                <w:rFonts w:ascii="Times New Roman" w:hAnsi="Times New Roman" w:cs="Times New Roman"/>
-                <w:webHidden/>
-                <w:sz w:val="28"/>
-                <w:szCs w:val="28"/>
+                <w:noProof/>
+                <w:webHidden/>
+              </w:rPr>
+              <w:t>11</w:t>
+            </w:r>
+            <w:r>
+              <w:rPr>
+                <w:noProof/>
+                <w:webHidden/>
               </w:rPr>
               <w:fldChar w:fldCharType="end"/>
             </w:r>
@@ -1929,85 +1668,69 @@
             <w:tabs>
               <w:tab w:val="right" w:leader="dot" w:pos="8778"/>
             </w:tabs>
-            <w:jc w:val="both"/>
             <w:rPr>
-              <w:rFonts w:ascii="Times New Roman" w:hAnsi="Times New Roman" w:cs="Times New Roman"/>
+              <w:noProof/>
               <w:kern w:val="2"/>
-              <w:sz w:val="28"/>
-              <w:szCs w:val="28"/>
-              <w:lang w:eastAsia="es-AR"/>
+              <w:sz w:val="24"/>
+              <w:szCs w:val="24"/>
+              <w:lang w:val="es-AR" w:eastAsia="es-AR"/>
               <w14:ligatures w14:val="standardContextual"/>
             </w:rPr>
           </w:pPr>
-          <w:hyperlink w:anchor="_Toc239430876" w:history="1">
+          <w:hyperlink w:anchor="_Toc241855817" w:history="1">
             <w:r>
               <w:rPr>
                 <w:rStyle w:val="Hipervnculo"/>
                 <w:rFonts w:ascii="Times New Roman" w:hAnsi="Times New Roman" w:cs="Times New Roman"/>
-                <w:sz w:val="28"/>
-                <w:szCs w:val="28"/>
-              </w:rPr>
-              <w:t>5.4  Editar los datos de un cliente</w:t>
-            </w:r>
-            <w:r>
-              <w:rPr>
-                <w:rFonts w:ascii="Times New Roman" w:hAnsi="Times New Roman" w:cs="Times New Roman"/>
-                <w:webHidden/>
-                <w:sz w:val="28"/>
-                <w:szCs w:val="28"/>
+                <w:noProof/>
+              </w:rPr>
+              <w:t>5.4 Editar los datos de un cliente</w:t>
+            </w:r>
+            <w:r>
+              <w:rPr>
+                <w:noProof/>
+                <w:webHidden/>
               </w:rPr>
               <w:tab/>
             </w:r>
             <w:r>
               <w:rPr>
-                <w:rFonts w:ascii="Times New Roman" w:hAnsi="Times New Roman" w:cs="Times New Roman"/>
-                <w:webHidden/>
-                <w:sz w:val="28"/>
-                <w:szCs w:val="28"/>
+                <w:noProof/>
+                <w:webHidden/>
               </w:rPr>
               <w:fldChar w:fldCharType="begin"/>
             </w:r>
             <w:r>
               <w:rPr>
-                <w:rFonts w:ascii="Times New Roman" w:hAnsi="Times New Roman" w:cs="Times New Roman"/>
-                <w:webHidden/>
-                <w:sz w:val="28"/>
-                <w:szCs w:val="28"/>
-              </w:rPr>
-              <w:instrText xml:space="preserve"> PAGEREF _Toc239430876 \h </w:instrText>
-            </w:r>
-            <w:r>
-              <w:rPr>
-                <w:rFonts w:ascii="Times New Roman" w:hAnsi="Times New Roman" w:cs="Times New Roman"/>
-                <w:webHidden/>
-                <w:sz w:val="28"/>
-                <w:szCs w:val="28"/>
-              </w:rPr>
-            </w:r>
-            <w:r>
-              <w:rPr>
-                <w:rFonts w:ascii="Times New Roman" w:hAnsi="Times New Roman" w:cs="Times New Roman"/>
-                <w:webHidden/>
-                <w:sz w:val="28"/>
-                <w:szCs w:val="28"/>
+                <w:noProof/>
+                <w:webHidden/>
+              </w:rPr>
+              <w:instrText xml:space="preserve"> PAGEREF _Toc241855817 \h </w:instrText>
+            </w:r>
+            <w:r>
+              <w:rPr>
+                <w:noProof/>
+                <w:webHidden/>
+              </w:rPr>
+            </w:r>
+            <w:r>
+              <w:rPr>
+                <w:noProof/>
+                <w:webHidden/>
               </w:rPr>
               <w:fldChar w:fldCharType="separate"/>
             </w:r>
             <w:r>
               <w:rPr>
-                <w:rFonts w:ascii="Times New Roman" w:hAnsi="Times New Roman" w:cs="Times New Roman"/>
-                <w:webHidden/>
-                <w:sz w:val="28"/>
-                <w:szCs w:val="28"/>
-              </w:rPr>
-              <w:t>11</w:t>
-            </w:r>
-            <w:r>
-              <w:rPr>
-                <w:rFonts w:ascii="Times New Roman" w:hAnsi="Times New Roman" w:cs="Times New Roman"/>
-                <w:webHidden/>
-                <w:sz w:val="28"/>
-                <w:szCs w:val="28"/>
+                <w:noProof/>
+                <w:webHidden/>
+              </w:rPr>
+              <w:t>13</w:t>
+            </w:r>
+            <w:r>
+              <w:rPr>
+                <w:noProof/>
+                <w:webHidden/>
               </w:rPr>
               <w:fldChar w:fldCharType="end"/>
             </w:r>
@@ -2019,85 +1742,69 @@
             <w:tabs>
               <w:tab w:val="right" w:leader="dot" w:pos="8778"/>
             </w:tabs>
-            <w:jc w:val="both"/>
             <w:rPr>
-              <w:rFonts w:ascii="Times New Roman" w:hAnsi="Times New Roman" w:cs="Times New Roman"/>
+              <w:noProof/>
               <w:kern w:val="2"/>
-              <w:sz w:val="28"/>
-              <w:szCs w:val="28"/>
-              <w:lang w:eastAsia="es-AR"/>
+              <w:sz w:val="24"/>
+              <w:szCs w:val="24"/>
+              <w:lang w:val="es-AR" w:eastAsia="es-AR"/>
               <w14:ligatures w14:val="standardContextual"/>
             </w:rPr>
           </w:pPr>
-          <w:hyperlink w:anchor="_Toc239430877" w:history="1">
+          <w:hyperlink w:anchor="_Toc241855818" w:history="1">
             <w:r>
               <w:rPr>
                 <w:rStyle w:val="Hipervnculo"/>
                 <w:rFonts w:ascii="Times New Roman" w:hAnsi="Times New Roman" w:cs="Times New Roman"/>
-                <w:sz w:val="28"/>
-                <w:szCs w:val="28"/>
-              </w:rPr>
-              <w:t>5.5  Dar de baja a un cliente</w:t>
-            </w:r>
-            <w:r>
-              <w:rPr>
-                <w:rFonts w:ascii="Times New Roman" w:hAnsi="Times New Roman" w:cs="Times New Roman"/>
-                <w:webHidden/>
-                <w:sz w:val="28"/>
-                <w:szCs w:val="28"/>
+                <w:noProof/>
+              </w:rPr>
+              <w:t>5.5 Dar de baja a un cliente</w:t>
+            </w:r>
+            <w:r>
+              <w:rPr>
+                <w:noProof/>
+                <w:webHidden/>
               </w:rPr>
               <w:tab/>
             </w:r>
             <w:r>
               <w:rPr>
-                <w:rFonts w:ascii="Times New Roman" w:hAnsi="Times New Roman" w:cs="Times New Roman"/>
-                <w:webHidden/>
-                <w:sz w:val="28"/>
-                <w:szCs w:val="28"/>
+                <w:noProof/>
+                <w:webHidden/>
               </w:rPr>
               <w:fldChar w:fldCharType="begin"/>
             </w:r>
             <w:r>
               <w:rPr>
-                <w:rFonts w:ascii="Times New Roman" w:hAnsi="Times New Roman" w:cs="Times New Roman"/>
-                <w:webHidden/>
-                <w:sz w:val="28"/>
-                <w:szCs w:val="28"/>
-              </w:rPr>
-              <w:instrText xml:space="preserve"> PAGEREF _Toc239430877 \h </w:instrText>
-            </w:r>
-            <w:r>
-              <w:rPr>
-                <w:rFonts w:ascii="Times New Roman" w:hAnsi="Times New Roman" w:cs="Times New Roman"/>
-                <w:webHidden/>
-                <w:sz w:val="28"/>
-                <w:szCs w:val="28"/>
-              </w:rPr>
-            </w:r>
-            <w:r>
-              <w:rPr>
-                <w:rFonts w:ascii="Times New Roman" w:hAnsi="Times New Roman" w:cs="Times New Roman"/>
-                <w:webHidden/>
-                <w:sz w:val="28"/>
-                <w:szCs w:val="28"/>
+                <w:noProof/>
+                <w:webHidden/>
+              </w:rPr>
+              <w:instrText xml:space="preserve"> PAGEREF _Toc241855818 \h </w:instrText>
+            </w:r>
+            <w:r>
+              <w:rPr>
+                <w:noProof/>
+                <w:webHidden/>
+              </w:rPr>
+            </w:r>
+            <w:r>
+              <w:rPr>
+                <w:noProof/>
+                <w:webHidden/>
               </w:rPr>
               <w:fldChar w:fldCharType="separate"/>
             </w:r>
             <w:r>
               <w:rPr>
-                <w:rFonts w:ascii="Times New Roman" w:hAnsi="Times New Roman" w:cs="Times New Roman"/>
-                <w:webHidden/>
-                <w:sz w:val="28"/>
-                <w:szCs w:val="28"/>
-              </w:rPr>
-              <w:t>11</w:t>
-            </w:r>
-            <w:r>
-              <w:rPr>
-                <w:rFonts w:ascii="Times New Roman" w:hAnsi="Times New Roman" w:cs="Times New Roman"/>
-                <w:webHidden/>
-                <w:sz w:val="28"/>
-                <w:szCs w:val="28"/>
+                <w:noProof/>
+                <w:webHidden/>
+              </w:rPr>
+              <w:t>13</w:t>
+            </w:r>
+            <w:r>
+              <w:rPr>
+                <w:noProof/>
+                <w:webHidden/>
               </w:rPr>
               <w:fldChar w:fldCharType="end"/>
             </w:r>
@@ -2109,85 +1816,69 @@
             <w:tabs>
               <w:tab w:val="right" w:leader="dot" w:pos="8778"/>
             </w:tabs>
-            <w:jc w:val="both"/>
             <w:rPr>
-              <w:rFonts w:ascii="Times New Roman" w:hAnsi="Times New Roman" w:cs="Times New Roman"/>
+              <w:noProof/>
               <w:kern w:val="2"/>
-              <w:sz w:val="28"/>
-              <w:szCs w:val="28"/>
-              <w:lang w:eastAsia="es-AR"/>
+              <w:sz w:val="24"/>
+              <w:szCs w:val="24"/>
+              <w:lang w:val="es-AR" w:eastAsia="es-AR"/>
               <w14:ligatures w14:val="standardContextual"/>
             </w:rPr>
           </w:pPr>
-          <w:hyperlink w:anchor="_Toc239430878" w:history="1">
+          <w:hyperlink w:anchor="_Toc241855819" w:history="1">
             <w:r>
               <w:rPr>
                 <w:rStyle w:val="Hipervnculo"/>
                 <w:rFonts w:ascii="Times New Roman" w:hAnsi="Times New Roman" w:cs="Times New Roman"/>
-                <w:sz w:val="28"/>
-                <w:szCs w:val="28"/>
+                <w:noProof/>
               </w:rPr>
               <w:t>6.  Módulo 6 – Usuarios y Accesos</w:t>
             </w:r>
             <w:r>
               <w:rPr>
-                <w:rFonts w:ascii="Times New Roman" w:hAnsi="Times New Roman" w:cs="Times New Roman"/>
-                <w:webHidden/>
-                <w:sz w:val="28"/>
-                <w:szCs w:val="28"/>
+                <w:noProof/>
+                <w:webHidden/>
               </w:rPr>
               <w:tab/>
             </w:r>
             <w:r>
               <w:rPr>
-                <w:rFonts w:ascii="Times New Roman" w:hAnsi="Times New Roman" w:cs="Times New Roman"/>
-                <w:webHidden/>
-                <w:sz w:val="28"/>
-                <w:szCs w:val="28"/>
+                <w:noProof/>
+                <w:webHidden/>
               </w:rPr>
               <w:fldChar w:fldCharType="begin"/>
             </w:r>
             <w:r>
               <w:rPr>
-                <w:rFonts w:ascii="Times New Roman" w:hAnsi="Times New Roman" w:cs="Times New Roman"/>
-                <w:webHidden/>
-                <w:sz w:val="28"/>
-                <w:szCs w:val="28"/>
-              </w:rPr>
-              <w:instrText xml:space="preserve"> PAGEREF _Toc239430878 \h </w:instrText>
-            </w:r>
-            <w:r>
-              <w:rPr>
-                <w:rFonts w:ascii="Times New Roman" w:hAnsi="Times New Roman" w:cs="Times New Roman"/>
-                <w:webHidden/>
-                <w:sz w:val="28"/>
-                <w:szCs w:val="28"/>
-              </w:rPr>
-            </w:r>
-            <w:r>
-              <w:rPr>
-                <w:rFonts w:ascii="Times New Roman" w:hAnsi="Times New Roman" w:cs="Times New Roman"/>
-                <w:webHidden/>
-                <w:sz w:val="28"/>
-                <w:szCs w:val="28"/>
+                <w:noProof/>
+                <w:webHidden/>
+              </w:rPr>
+              <w:instrText xml:space="preserve"> PAGEREF _Toc241855819 \h </w:instrText>
+            </w:r>
+            <w:r>
+              <w:rPr>
+                <w:noProof/>
+                <w:webHidden/>
+              </w:rPr>
+            </w:r>
+            <w:r>
+              <w:rPr>
+                <w:noProof/>
+                <w:webHidden/>
               </w:rPr>
               <w:fldChar w:fldCharType="separate"/>
             </w:r>
             <w:r>
               <w:rPr>
-                <w:rFonts w:ascii="Times New Roman" w:hAnsi="Times New Roman" w:cs="Times New Roman"/>
-                <w:webHidden/>
-                <w:sz w:val="28"/>
-                <w:szCs w:val="28"/>
-              </w:rPr>
-              <w:t>13</w:t>
-            </w:r>
-            <w:r>
-              <w:rPr>
-                <w:rFonts w:ascii="Times New Roman" w:hAnsi="Times New Roman" w:cs="Times New Roman"/>
-                <w:webHidden/>
-                <w:sz w:val="28"/>
-                <w:szCs w:val="28"/>
+                <w:noProof/>
+                <w:webHidden/>
+              </w:rPr>
+              <w:t>15</w:t>
+            </w:r>
+            <w:r>
+              <w:rPr>
+                <w:noProof/>
+                <w:webHidden/>
               </w:rPr>
               <w:fldChar w:fldCharType="end"/>
             </w:r>
@@ -2199,85 +1890,69 @@
             <w:tabs>
               <w:tab w:val="right" w:leader="dot" w:pos="8778"/>
             </w:tabs>
-            <w:jc w:val="both"/>
             <w:rPr>
-              <w:rFonts w:ascii="Times New Roman" w:hAnsi="Times New Roman" w:cs="Times New Roman"/>
+              <w:noProof/>
               <w:kern w:val="2"/>
-              <w:sz w:val="28"/>
-              <w:szCs w:val="28"/>
-              <w:lang w:eastAsia="es-AR"/>
+              <w:sz w:val="24"/>
+              <w:szCs w:val="24"/>
+              <w:lang w:val="es-AR" w:eastAsia="es-AR"/>
               <w14:ligatures w14:val="standardContextual"/>
             </w:rPr>
           </w:pPr>
-          <w:hyperlink w:anchor="_Toc239430879" w:history="1">
+          <w:hyperlink w:anchor="_Toc241855820" w:history="1">
             <w:r>
               <w:rPr>
                 <w:rStyle w:val="Hipervnculo"/>
                 <w:rFonts w:ascii="Times New Roman" w:hAnsi="Times New Roman" w:cs="Times New Roman"/>
-                <w:sz w:val="28"/>
-                <w:szCs w:val="28"/>
-              </w:rPr>
-              <w:t>6.1  Ver el listado de usuarios</w:t>
-            </w:r>
-            <w:r>
-              <w:rPr>
-                <w:rFonts w:ascii="Times New Roman" w:hAnsi="Times New Roman" w:cs="Times New Roman"/>
-                <w:webHidden/>
-                <w:sz w:val="28"/>
-                <w:szCs w:val="28"/>
+                <w:noProof/>
+              </w:rPr>
+              <w:t>6.1 Ver el listado de usuarios</w:t>
+            </w:r>
+            <w:r>
+              <w:rPr>
+                <w:noProof/>
+                <w:webHidden/>
               </w:rPr>
               <w:tab/>
             </w:r>
             <w:r>
               <w:rPr>
-                <w:rFonts w:ascii="Times New Roman" w:hAnsi="Times New Roman" w:cs="Times New Roman"/>
-                <w:webHidden/>
-                <w:sz w:val="28"/>
-                <w:szCs w:val="28"/>
+                <w:noProof/>
+                <w:webHidden/>
               </w:rPr>
               <w:fldChar w:fldCharType="begin"/>
             </w:r>
             <w:r>
               <w:rPr>
-                <w:rFonts w:ascii="Times New Roman" w:hAnsi="Times New Roman" w:cs="Times New Roman"/>
-                <w:webHidden/>
-                <w:sz w:val="28"/>
-                <w:szCs w:val="28"/>
-              </w:rPr>
-              <w:instrText xml:space="preserve"> PAGEREF _Toc239430879 \h </w:instrText>
-            </w:r>
-            <w:r>
-              <w:rPr>
-                <w:rFonts w:ascii="Times New Roman" w:hAnsi="Times New Roman" w:cs="Times New Roman"/>
-                <w:webHidden/>
-                <w:sz w:val="28"/>
-                <w:szCs w:val="28"/>
-              </w:rPr>
-            </w:r>
-            <w:r>
-              <w:rPr>
-                <w:rFonts w:ascii="Times New Roman" w:hAnsi="Times New Roman" w:cs="Times New Roman"/>
-                <w:webHidden/>
-                <w:sz w:val="28"/>
-                <w:szCs w:val="28"/>
+                <w:noProof/>
+                <w:webHidden/>
+              </w:rPr>
+              <w:instrText xml:space="preserve"> PAGEREF _Toc241855820 \h </w:instrText>
+            </w:r>
+            <w:r>
+              <w:rPr>
+                <w:noProof/>
+                <w:webHidden/>
+              </w:rPr>
+            </w:r>
+            <w:r>
+              <w:rPr>
+                <w:noProof/>
+                <w:webHidden/>
               </w:rPr>
               <w:fldChar w:fldCharType="separate"/>
             </w:r>
             <w:r>
               <w:rPr>
-                <w:rFonts w:ascii="Times New Roman" w:hAnsi="Times New Roman" w:cs="Times New Roman"/>
-                <w:webHidden/>
-                <w:sz w:val="28"/>
-                <w:szCs w:val="28"/>
-              </w:rPr>
-              <w:t>13</w:t>
-            </w:r>
-            <w:r>
-              <w:rPr>
-                <w:rFonts w:ascii="Times New Roman" w:hAnsi="Times New Roman" w:cs="Times New Roman"/>
-                <w:webHidden/>
-                <w:sz w:val="28"/>
-                <w:szCs w:val="28"/>
+                <w:noProof/>
+                <w:webHidden/>
+              </w:rPr>
+              <w:t>15</w:t>
+            </w:r>
+            <w:r>
+              <w:rPr>
+                <w:noProof/>
+                <w:webHidden/>
               </w:rPr>
               <w:fldChar w:fldCharType="end"/>
             </w:r>
@@ -2289,85 +1964,69 @@
             <w:tabs>
               <w:tab w:val="right" w:leader="dot" w:pos="8778"/>
             </w:tabs>
-            <w:jc w:val="both"/>
             <w:rPr>
-              <w:rFonts w:ascii="Times New Roman" w:hAnsi="Times New Roman" w:cs="Times New Roman"/>
+              <w:noProof/>
               <w:kern w:val="2"/>
-              <w:sz w:val="28"/>
-              <w:szCs w:val="28"/>
-              <w:lang w:eastAsia="es-AR"/>
+              <w:sz w:val="24"/>
+              <w:szCs w:val="24"/>
+              <w:lang w:val="es-AR" w:eastAsia="es-AR"/>
               <w14:ligatures w14:val="standardContextual"/>
             </w:rPr>
           </w:pPr>
-          <w:hyperlink w:anchor="_Toc239430880" w:history="1">
+          <w:hyperlink w:anchor="_Toc241855821" w:history="1">
             <w:r>
               <w:rPr>
                 <w:rStyle w:val="Hipervnculo"/>
                 <w:rFonts w:ascii="Times New Roman" w:hAnsi="Times New Roman" w:cs="Times New Roman"/>
-                <w:sz w:val="28"/>
-                <w:szCs w:val="28"/>
-              </w:rPr>
-              <w:t>6.2  Crear un nuevo usuario empleado</w:t>
-            </w:r>
-            <w:r>
-              <w:rPr>
-                <w:rFonts w:ascii="Times New Roman" w:hAnsi="Times New Roman" w:cs="Times New Roman"/>
-                <w:webHidden/>
-                <w:sz w:val="28"/>
-                <w:szCs w:val="28"/>
+                <w:noProof/>
+              </w:rPr>
+              <w:t>6.2 Crear un nuevo usuario empleado</w:t>
+            </w:r>
+            <w:r>
+              <w:rPr>
+                <w:noProof/>
+                <w:webHidden/>
               </w:rPr>
               <w:tab/>
             </w:r>
             <w:r>
               <w:rPr>
-                <w:rFonts w:ascii="Times New Roman" w:hAnsi="Times New Roman" w:cs="Times New Roman"/>
-                <w:webHidden/>
-                <w:sz w:val="28"/>
-                <w:szCs w:val="28"/>
+                <w:noProof/>
+                <w:webHidden/>
               </w:rPr>
               <w:fldChar w:fldCharType="begin"/>
             </w:r>
             <w:r>
               <w:rPr>
-                <w:rFonts w:ascii="Times New Roman" w:hAnsi="Times New Roman" w:cs="Times New Roman"/>
-                <w:webHidden/>
-                <w:sz w:val="28"/>
-                <w:szCs w:val="28"/>
-              </w:rPr>
-              <w:instrText xml:space="preserve"> PAGEREF _Toc239430880 \h </w:instrText>
-            </w:r>
-            <w:r>
-              <w:rPr>
-                <w:rFonts w:ascii="Times New Roman" w:hAnsi="Times New Roman" w:cs="Times New Roman"/>
-                <w:webHidden/>
-                <w:sz w:val="28"/>
-                <w:szCs w:val="28"/>
-              </w:rPr>
-            </w:r>
-            <w:r>
-              <w:rPr>
-                <w:rFonts w:ascii="Times New Roman" w:hAnsi="Times New Roman" w:cs="Times New Roman"/>
-                <w:webHidden/>
-                <w:sz w:val="28"/>
-                <w:szCs w:val="28"/>
+                <w:noProof/>
+                <w:webHidden/>
+              </w:rPr>
+              <w:instrText xml:space="preserve"> PAGEREF _Toc241855821 \h </w:instrText>
+            </w:r>
+            <w:r>
+              <w:rPr>
+                <w:noProof/>
+                <w:webHidden/>
+              </w:rPr>
+            </w:r>
+            <w:r>
+              <w:rPr>
+                <w:noProof/>
+                <w:webHidden/>
               </w:rPr>
               <w:fldChar w:fldCharType="separate"/>
             </w:r>
             <w:r>
               <w:rPr>
-                <w:rFonts w:ascii="Times New Roman" w:hAnsi="Times New Roman" w:cs="Times New Roman"/>
-                <w:webHidden/>
-                <w:sz w:val="28"/>
-                <w:szCs w:val="28"/>
-              </w:rPr>
-              <w:t>13</w:t>
-            </w:r>
-            <w:r>
-              <w:rPr>
-                <w:rFonts w:ascii="Times New Roman" w:hAnsi="Times New Roman" w:cs="Times New Roman"/>
-                <w:webHidden/>
-                <w:sz w:val="28"/>
-                <w:szCs w:val="28"/>
+                <w:noProof/>
+                <w:webHidden/>
+              </w:rPr>
+              <w:t>16</w:t>
+            </w:r>
+            <w:r>
+              <w:rPr>
+                <w:noProof/>
+                <w:webHidden/>
               </w:rPr>
               <w:fldChar w:fldCharType="end"/>
             </w:r>
@@ -2379,85 +2038,69 @@
             <w:tabs>
               <w:tab w:val="right" w:leader="dot" w:pos="8778"/>
             </w:tabs>
-            <w:jc w:val="both"/>
             <w:rPr>
-              <w:rFonts w:ascii="Times New Roman" w:hAnsi="Times New Roman" w:cs="Times New Roman"/>
+              <w:noProof/>
               <w:kern w:val="2"/>
-              <w:sz w:val="28"/>
-              <w:szCs w:val="28"/>
-              <w:lang w:eastAsia="es-AR"/>
+              <w:sz w:val="24"/>
+              <w:szCs w:val="24"/>
+              <w:lang w:val="es-AR" w:eastAsia="es-AR"/>
               <w14:ligatures w14:val="standardContextual"/>
             </w:rPr>
           </w:pPr>
-          <w:hyperlink w:anchor="_Toc239430881" w:history="1">
+          <w:hyperlink w:anchor="_Toc241855822" w:history="1">
             <w:r>
               <w:rPr>
                 <w:rStyle w:val="Hipervnculo"/>
                 <w:rFonts w:ascii="Times New Roman" w:hAnsi="Times New Roman" w:cs="Times New Roman"/>
-                <w:sz w:val="28"/>
-                <w:szCs w:val="28"/>
-              </w:rPr>
-              <w:t>6.3  Crear un nuevo usuario administrador</w:t>
-            </w:r>
-            <w:r>
-              <w:rPr>
-                <w:rFonts w:ascii="Times New Roman" w:hAnsi="Times New Roman" w:cs="Times New Roman"/>
-                <w:webHidden/>
-                <w:sz w:val="28"/>
-                <w:szCs w:val="28"/>
+                <w:noProof/>
+              </w:rPr>
+              <w:t>6.3 Crear un nuevo usuario administrador</w:t>
+            </w:r>
+            <w:r>
+              <w:rPr>
+                <w:noProof/>
+                <w:webHidden/>
               </w:rPr>
               <w:tab/>
             </w:r>
             <w:r>
               <w:rPr>
-                <w:rFonts w:ascii="Times New Roman" w:hAnsi="Times New Roman" w:cs="Times New Roman"/>
-                <w:webHidden/>
-                <w:sz w:val="28"/>
-                <w:szCs w:val="28"/>
+                <w:noProof/>
+                <w:webHidden/>
               </w:rPr>
               <w:fldChar w:fldCharType="begin"/>
             </w:r>
             <w:r>
               <w:rPr>
-                <w:rFonts w:ascii="Times New Roman" w:hAnsi="Times New Roman" w:cs="Times New Roman"/>
-                <w:webHidden/>
-                <w:sz w:val="28"/>
-                <w:szCs w:val="28"/>
-              </w:rPr>
-              <w:instrText xml:space="preserve"> PAGEREF _Toc239430881 \h </w:instrText>
-            </w:r>
-            <w:r>
-              <w:rPr>
-                <w:rFonts w:ascii="Times New Roman" w:hAnsi="Times New Roman" w:cs="Times New Roman"/>
-                <w:webHidden/>
-                <w:sz w:val="28"/>
-                <w:szCs w:val="28"/>
-              </w:rPr>
-            </w:r>
-            <w:r>
-              <w:rPr>
-                <w:rFonts w:ascii="Times New Roman" w:hAnsi="Times New Roman" w:cs="Times New Roman"/>
-                <w:webHidden/>
-                <w:sz w:val="28"/>
-                <w:szCs w:val="28"/>
+                <w:noProof/>
+                <w:webHidden/>
+              </w:rPr>
+              <w:instrText xml:space="preserve"> PAGEREF _Toc241855822 \h </w:instrText>
+            </w:r>
+            <w:r>
+              <w:rPr>
+                <w:noProof/>
+                <w:webHidden/>
+              </w:rPr>
+            </w:r>
+            <w:r>
+              <w:rPr>
+                <w:noProof/>
+                <w:webHidden/>
               </w:rPr>
               <w:fldChar w:fldCharType="separate"/>
             </w:r>
             <w:r>
               <w:rPr>
-                <w:rFonts w:ascii="Times New Roman" w:hAnsi="Times New Roman" w:cs="Times New Roman"/>
-                <w:webHidden/>
-                <w:sz w:val="28"/>
-                <w:szCs w:val="28"/>
-              </w:rPr>
-              <w:t>14</w:t>
-            </w:r>
-            <w:r>
-              <w:rPr>
-                <w:rFonts w:ascii="Times New Roman" w:hAnsi="Times New Roman" w:cs="Times New Roman"/>
-                <w:webHidden/>
-                <w:sz w:val="28"/>
-                <w:szCs w:val="28"/>
+                <w:noProof/>
+                <w:webHidden/>
+              </w:rPr>
+              <w:t>17</w:t>
+            </w:r>
+            <w:r>
+              <w:rPr>
+                <w:noProof/>
+                <w:webHidden/>
               </w:rPr>
               <w:fldChar w:fldCharType="end"/>
             </w:r>
@@ -2469,85 +2112,69 @@
             <w:tabs>
               <w:tab w:val="right" w:leader="dot" w:pos="8778"/>
             </w:tabs>
-            <w:jc w:val="both"/>
             <w:rPr>
-              <w:rFonts w:ascii="Times New Roman" w:hAnsi="Times New Roman" w:cs="Times New Roman"/>
+              <w:noProof/>
               <w:kern w:val="2"/>
-              <w:sz w:val="28"/>
-              <w:szCs w:val="28"/>
-              <w:lang w:eastAsia="es-AR"/>
+              <w:sz w:val="24"/>
+              <w:szCs w:val="24"/>
+              <w:lang w:val="es-AR" w:eastAsia="es-AR"/>
               <w14:ligatures w14:val="standardContextual"/>
             </w:rPr>
           </w:pPr>
-          <w:hyperlink w:anchor="_Toc239430882" w:history="1">
+          <w:hyperlink w:anchor="_Toc241855823" w:history="1">
             <w:r>
               <w:rPr>
                 <w:rStyle w:val="Hipervnculo"/>
                 <w:rFonts w:ascii="Times New Roman" w:hAnsi="Times New Roman" w:cs="Times New Roman"/>
-                <w:sz w:val="28"/>
-                <w:szCs w:val="28"/>
-              </w:rPr>
-              <w:t>6.4  Desactivar un usuario</w:t>
-            </w:r>
-            <w:r>
-              <w:rPr>
-                <w:rFonts w:ascii="Times New Roman" w:hAnsi="Times New Roman" w:cs="Times New Roman"/>
-                <w:webHidden/>
-                <w:sz w:val="28"/>
-                <w:szCs w:val="28"/>
+                <w:noProof/>
+              </w:rPr>
+              <w:t>6.4 Desactivar un usuario</w:t>
+            </w:r>
+            <w:r>
+              <w:rPr>
+                <w:noProof/>
+                <w:webHidden/>
               </w:rPr>
               <w:tab/>
             </w:r>
             <w:r>
               <w:rPr>
-                <w:rFonts w:ascii="Times New Roman" w:hAnsi="Times New Roman" w:cs="Times New Roman"/>
-                <w:webHidden/>
-                <w:sz w:val="28"/>
-                <w:szCs w:val="28"/>
+                <w:noProof/>
+                <w:webHidden/>
               </w:rPr>
               <w:fldChar w:fldCharType="begin"/>
             </w:r>
             <w:r>
               <w:rPr>
-                <w:rFonts w:ascii="Times New Roman" w:hAnsi="Times New Roman" w:cs="Times New Roman"/>
-                <w:webHidden/>
-                <w:sz w:val="28"/>
-                <w:szCs w:val="28"/>
-              </w:rPr>
-              <w:instrText xml:space="preserve"> PAGEREF _Toc239430882 \h </w:instrText>
-            </w:r>
-            <w:r>
-              <w:rPr>
-                <w:rFonts w:ascii="Times New Roman" w:hAnsi="Times New Roman" w:cs="Times New Roman"/>
-                <w:webHidden/>
-                <w:sz w:val="28"/>
-                <w:szCs w:val="28"/>
-              </w:rPr>
-            </w:r>
-            <w:r>
-              <w:rPr>
-                <w:rFonts w:ascii="Times New Roman" w:hAnsi="Times New Roman" w:cs="Times New Roman"/>
-                <w:webHidden/>
-                <w:sz w:val="28"/>
-                <w:szCs w:val="28"/>
+                <w:noProof/>
+                <w:webHidden/>
+              </w:rPr>
+              <w:instrText xml:space="preserve"> PAGEREF _Toc241855823 \h </w:instrText>
+            </w:r>
+            <w:r>
+              <w:rPr>
+                <w:noProof/>
+                <w:webHidden/>
+              </w:rPr>
+            </w:r>
+            <w:r>
+              <w:rPr>
+                <w:noProof/>
+                <w:webHidden/>
               </w:rPr>
               <w:fldChar w:fldCharType="separate"/>
             </w:r>
             <w:r>
               <w:rPr>
-                <w:rFonts w:ascii="Times New Roman" w:hAnsi="Times New Roman" w:cs="Times New Roman"/>
-                <w:webHidden/>
-                <w:sz w:val="28"/>
-                <w:szCs w:val="28"/>
-              </w:rPr>
-              <w:t>15</w:t>
-            </w:r>
-            <w:r>
-              <w:rPr>
-                <w:rFonts w:ascii="Times New Roman" w:hAnsi="Times New Roman" w:cs="Times New Roman"/>
-                <w:webHidden/>
-                <w:sz w:val="28"/>
-                <w:szCs w:val="28"/>
+                <w:noProof/>
+                <w:webHidden/>
+              </w:rPr>
+              <w:t>18</w:t>
+            </w:r>
+            <w:r>
+              <w:rPr>
+                <w:noProof/>
+                <w:webHidden/>
               </w:rPr>
               <w:fldChar w:fldCharType="end"/>
             </w:r>
@@ -2559,85 +2186,69 @@
             <w:tabs>
               <w:tab w:val="right" w:leader="dot" w:pos="8778"/>
             </w:tabs>
-            <w:jc w:val="both"/>
             <w:rPr>
-              <w:rFonts w:ascii="Times New Roman" w:hAnsi="Times New Roman" w:cs="Times New Roman"/>
+              <w:noProof/>
               <w:kern w:val="2"/>
-              <w:sz w:val="28"/>
-              <w:szCs w:val="28"/>
-              <w:lang w:eastAsia="es-AR"/>
+              <w:sz w:val="24"/>
+              <w:szCs w:val="24"/>
+              <w:lang w:val="es-AR" w:eastAsia="es-AR"/>
               <w14:ligatures w14:val="standardContextual"/>
             </w:rPr>
           </w:pPr>
-          <w:hyperlink w:anchor="_Toc239430883" w:history="1">
+          <w:hyperlink w:anchor="_Toc241855824" w:history="1">
             <w:r>
               <w:rPr>
                 <w:rStyle w:val="Hipervnculo"/>
                 <w:rFonts w:ascii="Times New Roman" w:hAnsi="Times New Roman" w:cs="Times New Roman"/>
-                <w:sz w:val="28"/>
-                <w:szCs w:val="28"/>
-              </w:rPr>
-              <w:t>7.  Referencia de estados</w:t>
-            </w:r>
-            <w:r>
-              <w:rPr>
-                <w:rFonts w:ascii="Times New Roman" w:hAnsi="Times New Roman" w:cs="Times New Roman"/>
-                <w:webHidden/>
-                <w:sz w:val="28"/>
-                <w:szCs w:val="28"/>
+                <w:noProof/>
+              </w:rPr>
+              <w:t>7. Referencia de estados</w:t>
+            </w:r>
+            <w:r>
+              <w:rPr>
+                <w:noProof/>
+                <w:webHidden/>
               </w:rPr>
               <w:tab/>
             </w:r>
             <w:r>
               <w:rPr>
-                <w:rFonts w:ascii="Times New Roman" w:hAnsi="Times New Roman" w:cs="Times New Roman"/>
-                <w:webHidden/>
-                <w:sz w:val="28"/>
-                <w:szCs w:val="28"/>
+                <w:noProof/>
+                <w:webHidden/>
               </w:rPr>
               <w:fldChar w:fldCharType="begin"/>
             </w:r>
             <w:r>
               <w:rPr>
-                <w:rFonts w:ascii="Times New Roman" w:hAnsi="Times New Roman" w:cs="Times New Roman"/>
-                <w:webHidden/>
-                <w:sz w:val="28"/>
-                <w:szCs w:val="28"/>
-              </w:rPr>
-              <w:instrText xml:space="preserve"> PAGEREF _Toc239430883 \h </w:instrText>
-            </w:r>
-            <w:r>
-              <w:rPr>
-                <w:rFonts w:ascii="Times New Roman" w:hAnsi="Times New Roman" w:cs="Times New Roman"/>
-                <w:webHidden/>
-                <w:sz w:val="28"/>
-                <w:szCs w:val="28"/>
-              </w:rPr>
-            </w:r>
-            <w:r>
-              <w:rPr>
-                <w:rFonts w:ascii="Times New Roman" w:hAnsi="Times New Roman" w:cs="Times New Roman"/>
-                <w:webHidden/>
-                <w:sz w:val="28"/>
-                <w:szCs w:val="28"/>
+                <w:noProof/>
+                <w:webHidden/>
+              </w:rPr>
+              <w:instrText xml:space="preserve"> PAGEREF _Toc241855824 \h </w:instrText>
+            </w:r>
+            <w:r>
+              <w:rPr>
+                <w:noProof/>
+                <w:webHidden/>
+              </w:rPr>
+            </w:r>
+            <w:r>
+              <w:rPr>
+                <w:noProof/>
+                <w:webHidden/>
               </w:rPr>
               <w:fldChar w:fldCharType="separate"/>
             </w:r>
             <w:r>
               <w:rPr>
-                <w:rFonts w:ascii="Times New Roman" w:hAnsi="Times New Roman" w:cs="Times New Roman"/>
-                <w:webHidden/>
-                <w:sz w:val="28"/>
-                <w:szCs w:val="28"/>
-              </w:rPr>
-              <w:t>17</w:t>
-            </w:r>
-            <w:r>
-              <w:rPr>
-                <w:rFonts w:ascii="Times New Roman" w:hAnsi="Times New Roman" w:cs="Times New Roman"/>
-                <w:webHidden/>
-                <w:sz w:val="28"/>
-                <w:szCs w:val="28"/>
+                <w:noProof/>
+                <w:webHidden/>
+              </w:rPr>
+              <w:t>20</w:t>
+            </w:r>
+            <w:r>
+              <w:rPr>
+                <w:noProof/>
+                <w:webHidden/>
               </w:rPr>
               <w:fldChar w:fldCharType="end"/>
             </w:r>
@@ -2649,85 +2260,69 @@
             <w:tabs>
               <w:tab w:val="right" w:leader="dot" w:pos="8778"/>
             </w:tabs>
-            <w:jc w:val="both"/>
             <w:rPr>
-              <w:rFonts w:ascii="Times New Roman" w:hAnsi="Times New Roman" w:cs="Times New Roman"/>
+              <w:noProof/>
               <w:kern w:val="2"/>
-              <w:sz w:val="28"/>
-              <w:szCs w:val="28"/>
-              <w:lang w:eastAsia="es-AR"/>
+              <w:sz w:val="24"/>
+              <w:szCs w:val="24"/>
+              <w:lang w:val="es-AR" w:eastAsia="es-AR"/>
               <w14:ligatures w14:val="standardContextual"/>
             </w:rPr>
           </w:pPr>
-          <w:hyperlink w:anchor="_Toc239430884" w:history="1">
+          <w:hyperlink w:anchor="_Toc241855825" w:history="1">
             <w:r>
               <w:rPr>
                 <w:rStyle w:val="Hipervnculo"/>
                 <w:rFonts w:ascii="Times New Roman" w:hAnsi="Times New Roman" w:cs="Times New Roman"/>
-                <w:sz w:val="28"/>
-                <w:szCs w:val="28"/>
+                <w:noProof/>
               </w:rPr>
               <w:t>Estados de clientes</w:t>
             </w:r>
             <w:r>
               <w:rPr>
-                <w:rFonts w:ascii="Times New Roman" w:hAnsi="Times New Roman" w:cs="Times New Roman"/>
-                <w:webHidden/>
-                <w:sz w:val="28"/>
-                <w:szCs w:val="28"/>
+                <w:noProof/>
+                <w:webHidden/>
               </w:rPr>
               <w:tab/>
             </w:r>
             <w:r>
               <w:rPr>
-                <w:rFonts w:ascii="Times New Roman" w:hAnsi="Times New Roman" w:cs="Times New Roman"/>
-                <w:webHidden/>
-                <w:sz w:val="28"/>
-                <w:szCs w:val="28"/>
+                <w:noProof/>
+                <w:webHidden/>
               </w:rPr>
               <w:fldChar w:fldCharType="begin"/>
             </w:r>
             <w:r>
               <w:rPr>
-                <w:rFonts w:ascii="Times New Roman" w:hAnsi="Times New Roman" w:cs="Times New Roman"/>
-                <w:webHidden/>
-                <w:sz w:val="28"/>
-                <w:szCs w:val="28"/>
-              </w:rPr>
-              <w:instrText xml:space="preserve"> PAGEREF _Toc239430884 \h </w:instrText>
-            </w:r>
-            <w:r>
-              <w:rPr>
-                <w:rFonts w:ascii="Times New Roman" w:hAnsi="Times New Roman" w:cs="Times New Roman"/>
-                <w:webHidden/>
-                <w:sz w:val="28"/>
-                <w:szCs w:val="28"/>
-              </w:rPr>
-            </w:r>
-            <w:r>
-              <w:rPr>
-                <w:rFonts w:ascii="Times New Roman" w:hAnsi="Times New Roman" w:cs="Times New Roman"/>
-                <w:webHidden/>
-                <w:sz w:val="28"/>
-                <w:szCs w:val="28"/>
+                <w:noProof/>
+                <w:webHidden/>
+              </w:rPr>
+              <w:instrText xml:space="preserve"> PAGEREF _Toc241855825 \h </w:instrText>
+            </w:r>
+            <w:r>
+              <w:rPr>
+                <w:noProof/>
+                <w:webHidden/>
+              </w:rPr>
+            </w:r>
+            <w:r>
+              <w:rPr>
+                <w:noProof/>
+                <w:webHidden/>
               </w:rPr>
               <w:fldChar w:fldCharType="separate"/>
             </w:r>
             <w:r>
               <w:rPr>
-                <w:rFonts w:ascii="Times New Roman" w:hAnsi="Times New Roman" w:cs="Times New Roman"/>
-                <w:webHidden/>
-                <w:sz w:val="28"/>
-                <w:szCs w:val="28"/>
-              </w:rPr>
-              <w:t>17</w:t>
-            </w:r>
-            <w:r>
-              <w:rPr>
-                <w:rFonts w:ascii="Times New Roman" w:hAnsi="Times New Roman" w:cs="Times New Roman"/>
-                <w:webHidden/>
-                <w:sz w:val="28"/>
-                <w:szCs w:val="28"/>
+                <w:noProof/>
+                <w:webHidden/>
+              </w:rPr>
+              <w:t>20</w:t>
+            </w:r>
+            <w:r>
+              <w:rPr>
+                <w:noProof/>
+                <w:webHidden/>
               </w:rPr>
               <w:fldChar w:fldCharType="end"/>
             </w:r>
@@ -2739,85 +2334,69 @@
             <w:tabs>
               <w:tab w:val="right" w:leader="dot" w:pos="8778"/>
             </w:tabs>
-            <w:jc w:val="both"/>
             <w:rPr>
-              <w:rFonts w:ascii="Times New Roman" w:hAnsi="Times New Roman" w:cs="Times New Roman"/>
+              <w:noProof/>
               <w:kern w:val="2"/>
-              <w:sz w:val="28"/>
-              <w:szCs w:val="28"/>
-              <w:lang w:eastAsia="es-AR"/>
+              <w:sz w:val="24"/>
+              <w:szCs w:val="24"/>
+              <w:lang w:val="es-AR" w:eastAsia="es-AR"/>
               <w14:ligatures w14:val="standardContextual"/>
             </w:rPr>
           </w:pPr>
-          <w:hyperlink w:anchor="_Toc239430885" w:history="1">
+          <w:hyperlink w:anchor="_Toc241855826" w:history="1">
             <w:r>
               <w:rPr>
                 <w:rStyle w:val="Hipervnculo"/>
                 <w:rFonts w:ascii="Times New Roman" w:hAnsi="Times New Roman" w:cs="Times New Roman"/>
-                <w:sz w:val="28"/>
-                <w:szCs w:val="28"/>
+                <w:noProof/>
               </w:rPr>
               <w:t>Estados de usuarios</w:t>
             </w:r>
             <w:r>
               <w:rPr>
-                <w:rFonts w:ascii="Times New Roman" w:hAnsi="Times New Roman" w:cs="Times New Roman"/>
-                <w:webHidden/>
-                <w:sz w:val="28"/>
-                <w:szCs w:val="28"/>
+                <w:noProof/>
+                <w:webHidden/>
               </w:rPr>
               <w:tab/>
             </w:r>
             <w:r>
               <w:rPr>
-                <w:rFonts w:ascii="Times New Roman" w:hAnsi="Times New Roman" w:cs="Times New Roman"/>
-                <w:webHidden/>
-                <w:sz w:val="28"/>
-                <w:szCs w:val="28"/>
+                <w:noProof/>
+                <w:webHidden/>
               </w:rPr>
               <w:fldChar w:fldCharType="begin"/>
             </w:r>
             <w:r>
               <w:rPr>
-                <w:rFonts w:ascii="Times New Roman" w:hAnsi="Times New Roman" w:cs="Times New Roman"/>
-                <w:webHidden/>
-                <w:sz w:val="28"/>
-                <w:szCs w:val="28"/>
-              </w:rPr>
-              <w:instrText xml:space="preserve"> PAGEREF _Toc239430885 \h </w:instrText>
-            </w:r>
-            <w:r>
-              <w:rPr>
-                <w:rFonts w:ascii="Times New Roman" w:hAnsi="Times New Roman" w:cs="Times New Roman"/>
-                <w:webHidden/>
-                <w:sz w:val="28"/>
-                <w:szCs w:val="28"/>
-              </w:rPr>
-            </w:r>
-            <w:r>
-              <w:rPr>
-                <w:rFonts w:ascii="Times New Roman" w:hAnsi="Times New Roman" w:cs="Times New Roman"/>
-                <w:webHidden/>
-                <w:sz w:val="28"/>
-                <w:szCs w:val="28"/>
+                <w:noProof/>
+                <w:webHidden/>
+              </w:rPr>
+              <w:instrText xml:space="preserve"> PAGEREF _Toc241855826 \h </w:instrText>
+            </w:r>
+            <w:r>
+              <w:rPr>
+                <w:noProof/>
+                <w:webHidden/>
+              </w:rPr>
+            </w:r>
+            <w:r>
+              <w:rPr>
+                <w:noProof/>
+                <w:webHidden/>
               </w:rPr>
               <w:fldChar w:fldCharType="separate"/>
             </w:r>
             <w:r>
               <w:rPr>
-                <w:rFonts w:ascii="Times New Roman" w:hAnsi="Times New Roman" w:cs="Times New Roman"/>
-                <w:webHidden/>
-                <w:sz w:val="28"/>
-                <w:szCs w:val="28"/>
-              </w:rPr>
-              <w:t>17</w:t>
-            </w:r>
-            <w:r>
-              <w:rPr>
-                <w:rFonts w:ascii="Times New Roman" w:hAnsi="Times New Roman" w:cs="Times New Roman"/>
-                <w:webHidden/>
-                <w:sz w:val="28"/>
-                <w:szCs w:val="28"/>
+                <w:noProof/>
+                <w:webHidden/>
+              </w:rPr>
+              <w:t>20</w:t>
+            </w:r>
+            <w:r>
+              <w:rPr>
+                <w:noProof/>
+                <w:webHidden/>
               </w:rPr>
               <w:fldChar w:fldCharType="end"/>
             </w:r>
@@ -2877,7 +2456,7 @@
           <w:szCs w:val="28"/>
         </w:rPr>
       </w:pPr>
-      <w:bookmarkStart w:id="0" w:name="_Toc239430861"/>
+      <w:bookmarkStart w:id="0" w:name="_Toc241855802"/>
       <w:r>
         <w:rPr>
           <w:rFonts w:ascii="Times New Roman" w:hAnsi="Times New Roman" w:cs="Times New Roman"/>
@@ -3011,7 +2590,7 @@
           <w:szCs w:val="28"/>
         </w:rPr>
       </w:pPr>
-      <w:bookmarkStart w:id="1" w:name="_Toc239430862"/>
+      <w:bookmarkStart w:id="1" w:name="_Toc241855803"/>
       <w:r>
         <w:rPr>
           <w:rFonts w:ascii="Times New Roman" w:hAnsi="Times New Roman" w:cs="Times New Roman"/>
@@ -3034,7 +2613,7 @@
           <w:szCs w:val="28"/>
         </w:rPr>
       </w:pPr>
-      <w:bookmarkStart w:id="2" w:name="_Toc239430863"/>
+      <w:bookmarkStart w:id="2" w:name="_Toc241855804"/>
       <w:r>
         <w:rPr>
           <w:rFonts w:ascii="Times New Roman" w:hAnsi="Times New Roman" w:cs="Times New Roman"/>
@@ -3351,7 +2930,7 @@
           <w:szCs w:val="28"/>
         </w:rPr>
       </w:pPr>
-      <w:bookmarkStart w:id="3" w:name="_Toc239430864"/>
+      <w:bookmarkStart w:id="3" w:name="_Toc241855805"/>
       <w:r>
         <w:rPr>
           <w:rFonts w:ascii="Times New Roman" w:hAnsi="Times New Roman" w:cs="Times New Roman"/>
@@ -3412,7 +2991,7 @@
           <w:szCs w:val="28"/>
         </w:rPr>
       </w:pPr>
-      <w:bookmarkStart w:id="4" w:name="_Toc239430865"/>
+      <w:bookmarkStart w:id="4" w:name="_Toc241855806"/>
       <w:r>
         <w:rPr>
           <w:rFonts w:ascii="Times New Roman" w:hAnsi="Times New Roman" w:cs="Times New Roman"/>
@@ -3860,7 +3439,7 @@
           <w:szCs w:val="28"/>
         </w:rPr>
       </w:pPr>
-      <w:bookmarkStart w:id="5" w:name="_Toc239430866"/>
+      <w:bookmarkStart w:id="5" w:name="_Toc241855807"/>
       <w:r>
         <w:rPr>
           <w:rFonts w:ascii="Times New Roman" w:hAnsi="Times New Roman" w:cs="Times New Roman"/>
@@ -4021,7 +3600,7 @@
           <w:szCs w:val="28"/>
         </w:rPr>
       </w:pPr>
-      <w:bookmarkStart w:id="6" w:name="_Toc239430867"/>
+      <w:bookmarkStart w:id="6" w:name="_Toc241855808"/>
       <w:r>
         <w:rPr>
           <w:rFonts w:ascii="Times New Roman" w:hAnsi="Times New Roman" w:cs="Times New Roman"/>
@@ -4476,7 +4055,7 @@
           <w:szCs w:val="28"/>
         </w:rPr>
       </w:pPr>
-      <w:bookmarkStart w:id="7" w:name="_Toc239430868"/>
+      <w:bookmarkStart w:id="7" w:name="_Toc241855809"/>
       <w:r>
         <w:rPr>
           <w:rFonts w:ascii="Times New Roman" w:hAnsi="Times New Roman" w:cs="Times New Roman"/>
@@ -4537,7 +4116,7 @@
           <w:szCs w:val="28"/>
         </w:rPr>
       </w:pPr>
-      <w:bookmarkStart w:id="8" w:name="_Toc239430869"/>
+      <w:bookmarkStart w:id="8" w:name="_Toc241855810"/>
       <w:r>
         <w:rPr>
           <w:rFonts w:ascii="Times New Roman" w:hAnsi="Times New Roman" w:cs="Times New Roman"/>
@@ -4810,7 +4389,7 @@
           <w:szCs w:val="28"/>
         </w:rPr>
       </w:pPr>
-      <w:bookmarkStart w:id="9" w:name="_Toc239430870"/>
+      <w:bookmarkStart w:id="9" w:name="_Toc241855811"/>
       <w:r>
         <w:rPr>
           <w:rFonts w:ascii="Times New Roman" w:hAnsi="Times New Roman" w:cs="Times New Roman"/>
@@ -5559,7 +5138,7 @@
           <w:szCs w:val="28"/>
         </w:rPr>
       </w:pPr>
-      <w:bookmarkStart w:id="10" w:name="_Toc239430871"/>
+      <w:bookmarkStart w:id="10" w:name="_Toc241855812"/>
       <w:r>
         <w:rPr>
           <w:rFonts w:ascii="Times New Roman" w:hAnsi="Times New Roman" w:cs="Times New Roman"/>
@@ -6543,7 +6122,7 @@
           <w:szCs w:val="28"/>
         </w:rPr>
       </w:pPr>
-      <w:bookmarkStart w:id="11" w:name="_Toc239430872"/>
+      <w:bookmarkStart w:id="11" w:name="_Toc241855813"/>
       <w:r>
         <w:rPr>
           <w:rFonts w:ascii="Times New Roman" w:hAnsi="Times New Roman" w:cs="Times New Roman"/>
@@ -6605,7 +6184,7 @@
           <w:szCs w:val="28"/>
         </w:rPr>
       </w:pPr>
-      <w:bookmarkStart w:id="12" w:name="_Toc239430873"/>
+      <w:bookmarkStart w:id="12" w:name="_Toc241855814"/>
       <w:r>
         <w:rPr>
           <w:rFonts w:ascii="Times New Roman" w:hAnsi="Times New Roman" w:cs="Times New Roman"/>
@@ -7279,7 +6858,7 @@
           <w:szCs w:val="28"/>
         </w:rPr>
       </w:pPr>
-      <w:bookmarkStart w:id="13" w:name="_Toc239430874"/>
+      <w:bookmarkStart w:id="13" w:name="_Toc241855815"/>
       <w:r>
         <w:rPr>
           <w:rFonts w:ascii="Times New Roman" w:hAnsi="Times New Roman" w:cs="Times New Roman"/>
@@ -7843,29 +7422,7 @@
           <w:szCs w:val="28"/>
         </w:rPr>
         <w:lastRenderedPageBreak/>
-        <w:t xml:space="preserve">Nota: Los usuarios de Soporte y Atención al cliente pueden ver la </w:t>
-      </w:r>
-      <w:proofErr w:type="gramStart"/>
-      <w:r>
-        <w:rPr>
-          <w:rFonts w:ascii="Times New Roman" w:hAnsi="Times New Roman" w:cs="Times New Roman"/>
-          <w:i/>
-          <w:color w:val="1A6B8A"/>
-          <w:sz w:val="28"/>
-          <w:szCs w:val="28"/>
-        </w:rPr>
-        <w:t>ficha</w:t>
-      </w:r>
-      <w:proofErr w:type="gramEnd"/>
-      <w:r>
-        <w:rPr>
-          <w:rFonts w:ascii="Times New Roman" w:hAnsi="Times New Roman" w:cs="Times New Roman"/>
-          <w:i/>
-          <w:color w:val="1A6B8A"/>
-          <w:sz w:val="28"/>
-          <w:szCs w:val="28"/>
-        </w:rPr>
-        <w:t xml:space="preserve"> pero no verán los botones Editar ni Dar de baja.</w:t>
+        <w:t>Nota: Los usuarios de Soporte y Atención al cliente pueden ver la ficha pero no verán los botones Editar ni Dar de baja.</w:t>
       </w:r>
     </w:p>
     <w:p>
@@ -7879,7 +7436,7 @@
           <w:szCs w:val="28"/>
         </w:rPr>
       </w:pPr>
-      <w:bookmarkStart w:id="14" w:name="_Toc239430875"/>
+      <w:bookmarkStart w:id="14" w:name="_Toc241855816"/>
       <w:r>
         <w:rPr>
           <w:rFonts w:ascii="Times New Roman" w:hAnsi="Times New Roman" w:cs="Times New Roman"/>
@@ -8878,7 +8435,7 @@
           <w:szCs w:val="28"/>
         </w:rPr>
       </w:pPr>
-      <w:bookmarkStart w:id="15" w:name="_Toc239430876"/>
+      <w:bookmarkStart w:id="15" w:name="_Toc241855817"/>
       <w:r>
         <w:rPr>
           <w:rFonts w:ascii="Times New Roman" w:hAnsi="Times New Roman" w:cs="Times New Roman"/>
@@ -9169,7 +8726,7 @@
           <w:szCs w:val="28"/>
         </w:rPr>
       </w:pPr>
-      <w:bookmarkStart w:id="16" w:name="_Toc239430877"/>
+      <w:bookmarkStart w:id="16" w:name="_Toc241855818"/>
       <w:r>
         <w:rPr>
           <w:rFonts w:ascii="Times New Roman" w:hAnsi="Times New Roman" w:cs="Times New Roman"/>
@@ -9441,7 +8998,7 @@
           <w:szCs w:val="28"/>
         </w:rPr>
       </w:pPr>
-      <w:bookmarkStart w:id="17" w:name="_Toc239430878"/>
+      <w:bookmarkStart w:id="17" w:name="_Toc241855819"/>
       <w:r>
         <w:rPr>
           <w:rFonts w:ascii="Times New Roman" w:hAnsi="Times New Roman" w:cs="Times New Roman"/>
@@ -9534,29 +9091,7 @@
           <w:sz w:val="28"/>
           <w:szCs w:val="28"/>
         </w:rPr>
-        <w:t xml:space="preserve">. Los usuarios de tipo Empleado no tienen acceso a esta sección </w:t>
-      </w:r>
-      <w:proofErr w:type="gramStart"/>
-      <w:r>
-        <w:rPr>
-          <w:rFonts w:ascii="Times New Roman" w:hAnsi="Times New Roman" w:cs="Times New Roman"/>
-          <w:b/>
-          <w:color w:val="B54500"/>
-          <w:sz w:val="28"/>
-          <w:szCs w:val="28"/>
-        </w:rPr>
-        <w:t>bajo ninguna circunstancia</w:t>
-      </w:r>
-      <w:proofErr w:type="gramEnd"/>
-      <w:r>
-        <w:rPr>
-          <w:rFonts w:ascii="Times New Roman" w:hAnsi="Times New Roman" w:cs="Times New Roman"/>
-          <w:b/>
-          <w:color w:val="B54500"/>
-          <w:sz w:val="28"/>
-          <w:szCs w:val="28"/>
-        </w:rPr>
-        <w:t>.</w:t>
+        <w:t>. Los usuarios de tipo Empleado no tienen acceso a esta sección bajo ninguna circunstancia.</w:t>
       </w:r>
     </w:p>
     <w:p>
@@ -9570,7 +9105,7 @@
           <w:szCs w:val="28"/>
         </w:rPr>
       </w:pPr>
-      <w:bookmarkStart w:id="18" w:name="_Toc239430879"/>
+      <w:bookmarkStart w:id="18" w:name="_Toc241855820"/>
       <w:r>
         <w:rPr>
           <w:rFonts w:ascii="Times New Roman" w:hAnsi="Times New Roman" w:cs="Times New Roman"/>
@@ -10013,7 +9548,7 @@
           <w:szCs w:val="28"/>
         </w:rPr>
       </w:pPr>
-      <w:bookmarkStart w:id="19" w:name="_Toc239430880"/>
+      <w:bookmarkStart w:id="19" w:name="_Toc241855821"/>
       <w:r>
         <w:rPr>
           <w:rFonts w:ascii="Times New Roman" w:hAnsi="Times New Roman" w:cs="Times New Roman"/>
@@ -10729,7 +10264,7 @@
           <w:szCs w:val="28"/>
         </w:rPr>
       </w:pPr>
-      <w:bookmarkStart w:id="20" w:name="_Toc239430881"/>
+      <w:bookmarkStart w:id="20" w:name="_Toc241855822"/>
       <w:r>
         <w:rPr>
           <w:rFonts w:ascii="Times New Roman" w:hAnsi="Times New Roman" w:cs="Times New Roman"/>
@@ -11267,7 +10802,7 @@
           <w:szCs w:val="28"/>
         </w:rPr>
       </w:pPr>
-      <w:bookmarkStart w:id="21" w:name="_Toc239430882"/>
+      <w:bookmarkStart w:id="21" w:name="_Toc241855823"/>
       <w:r>
         <w:rPr>
           <w:rFonts w:ascii="Times New Roman" w:hAnsi="Times New Roman" w:cs="Times New Roman"/>
@@ -11542,7 +11077,7 @@
           <w:szCs w:val="28"/>
         </w:rPr>
       </w:pPr>
-      <w:bookmarkStart w:id="22" w:name="_Toc239430883"/>
+      <w:bookmarkStart w:id="22" w:name="_Toc241855824"/>
       <w:r>
         <w:rPr>
           <w:rFonts w:ascii="Times New Roman" w:hAnsi="Times New Roman" w:cs="Times New Roman"/>
@@ -11566,7 +11101,7 @@
           <w:szCs w:val="28"/>
         </w:rPr>
       </w:pPr>
-      <w:bookmarkStart w:id="23" w:name="_Toc239430884"/>
+      <w:bookmarkStart w:id="23" w:name="_Toc241855825"/>
       <w:r>
         <w:rPr>
           <w:rFonts w:ascii="Times New Roman" w:hAnsi="Times New Roman" w:cs="Times New Roman"/>
@@ -11932,7 +11467,7 @@
           <w:szCs w:val="28"/>
         </w:rPr>
       </w:pPr>
-      <w:bookmarkStart w:id="24" w:name="_Toc239430885"/>
+      <w:bookmarkStart w:id="24" w:name="_Toc241855826"/>
       <w:r>
         <w:rPr>
           <w:rFonts w:ascii="Times New Roman" w:hAnsi="Times New Roman" w:cs="Times New Roman"/>

</xml_diff>